<commit_message>
Rebuild V14 prepublish checklist to match V12/V13/V15 canonical 13-section format
Adds: filename section, keyword score table, detailed thumbnail spec with S23 rules
and the discarded icon-grid alternative note, exact end-screen script text with the
V15-dependency warning, per-subreddit Reddit drafts, UTC time row, and a closing
"Notas de Outlier" section explaining title/hook/structure rationale.
Replaces the earlier simpler format that lacked these sections.

Co-Authored-By: Claude Sonnet 5 <noreply@anthropic.com>
Claude-Session: https://claude.ai/code/session_01L4D3BJE5wxKGrRneu3Lana
</commit_message>
<xml_diff>
--- a/V14_final_Prepublish_Checklist.docx
+++ b/V14_final_Prepublish_Checklist.docx
@@ -10,21 +10,9 @@
         <w:rPr>
           <w:b/>
           <w:color w:val="B02A2A"/>
-          <w:sz w:val="28"/>
+          <w:sz w:val="26"/>
         </w:rPr>
-        <w:t>NEUROCENTS — VIDEO 14 — PREPUBLISH CHECKLIST</w:t>
-      </w:r>
-    </w:p>
-    <w:p>
-      <w:pPr>
-        <w:jc w:val="center"/>
-      </w:pPr>
-      <w:r>
-        <w:rPr>
-          <w:color w:val="2C3E50"/>
-          <w:sz w:val="22"/>
-        </w:rPr>
-        <w:t>5 Things That Drain Your Money Before Payday (No Matter What You Earn)</w:t>
+        <w:t>NEUROCENTS — VIDEO 14 FINAL · PRE-PUBLISH CHECKLIST</w:t>
       </w:r>
     </w:p>
     <w:p>
@@ -36,27 +24,26 @@
           <w:color w:val="777777"/>
           <w:sz w:val="18"/>
         </w:rPr>
-        <w:t>Publish: Thursday 20:15 Spain (CEST) = 14:15 EST · 95 beats · Lista con Ranking · Hook S1</w:t>
+        <w:t>5 Things That Drain Your Money Before Payday (No Matter What You Earn) · 20:15 España / 14:15 EST</w:t>
       </w:r>
     </w:p>
     <w:p/>
     <w:p>
       <w:pPr>
-        <w:spacing w:before="280" w:after="60"/>
+        <w:spacing w:before="280" w:after="80"/>
       </w:pPr>
       <w:r>
         <w:rPr>
           <w:b/>
           <w:color w:val="B02A2A"/>
-          <w:sz w:val="20"/>
+          <w:sz w:val="22"/>
         </w:rPr>
-        <w:t>── TITLE &amp; METADATA ──</w:t>
+        <w:t>── 1. NOMBRE DEL ARCHIVO — renombrar el MP4 ANTES de subir ──</w:t>
       </w:r>
     </w:p>
     <w:p>
       <w:pPr>
-        <w:spacing w:before="40" w:after="40"/>
-        <w:ind w:left="283"/>
+        <w:spacing w:before="20" w:after="40"/>
       </w:pPr>
       <w:r>
         <w:rPr>
@@ -64,20 +51,44 @@
           <w:color w:val="777777"/>
           <w:sz w:val="18"/>
         </w:rPr>
-        <w:t xml:space="preserve">TITLE (primary): </w:t>
+        <w:t xml:space="preserve">ARCHIVO:  </w:t>
       </w:r>
       <w:r>
         <w:rPr>
-          <w:color w:val="2C3E50"/>
+          <w:color w:val="1A7A3C"/>
           <w:sz w:val="20"/>
         </w:rPr>
-        <w:t>5 Things That Drain Your Money Before Payday (No Matter What You Earn)</w:t>
+        <w:t>5-things-drain-money-before-payday-financial-psychology-neurocents.mp4</w:t>
       </w:r>
     </w:p>
     <w:p>
       <w:pPr>
-        <w:spacing w:before="40" w:after="40"/>
-        <w:ind w:left="283"/>
+        <w:spacing w:before="120" w:after="40"/>
+      </w:pPr>
+      <w:r>
+        <w:rPr>
+          <w:color w:val="CCCCCC"/>
+          <w:sz w:val="14"/>
+        </w:rPr>
+        <w:t>──────────────────────────────────────────────────────────────────────────────────────────</w:t>
+      </w:r>
+    </w:p>
+    <w:p>
+      <w:pPr>
+        <w:spacing w:before="280" w:after="80"/>
+      </w:pPr>
+      <w:r>
+        <w:rPr>
+          <w:b/>
+          <w:color w:val="B02A2A"/>
+          <w:sz w:val="22"/>
+        </w:rPr>
+        <w:t>── 2. TÍTULO — fórmula sector-wide S22 · lista con ranking ──</w:t>
+      </w:r>
+    </w:p>
+    <w:p>
+      <w:pPr>
+        <w:spacing w:before="20" w:after="40"/>
       </w:pPr>
       <w:r>
         <w:rPr>
@@ -85,20 +96,783 @@
           <w:color w:val="777777"/>
           <w:sz w:val="18"/>
         </w:rPr>
-        <w:t xml:space="preserve">TITLE (alt A): </w:t>
+        <w:t xml:space="preserve">TÍTULO PRINCIPAL:  </w:t>
       </w:r>
       <w:r>
         <w:rPr>
           <w:color w:val="2C3E50"/>
-          <w:sz w:val="20"/>
+          <w:sz w:val="24"/>
         </w:rPr>
-        <w:t>5 Reasons You're Broke Before Payday (No Matter What You Earn)</w:t>
+        <w:t>5 Things That Drain Your Money Before Payday (No Matter What You Earn)</w:t>
       </w:r>
     </w:p>
     <w:p>
       <w:pPr>
-        <w:spacing w:before="40" w:after="40"/>
+        <w:spacing w:before="20" w:after="20"/>
+      </w:pPr>
+      <w:r>
+        <w:rPr>
+          <w:b w:val="0"/>
+          <w:color w:val="777777"/>
+          <w:sz w:val="16"/>
+        </w:rPr>
+        <w:t>Fórmula: sector-wide universal (S22) — 'broke before payday' es tema del 99% de la audiencia financiera, no sub-nicho behavioral finance. El ángulo psicológico es el giro interno, no el gancho.</w:t>
+      </w:r>
+    </w:p>
+    <w:p>
+      <w:pPr>
+        <w:spacing w:before="20" w:after="20"/>
+      </w:pPr>
+      <w:r>
+        <w:rPr>
+          <w:b w:val="0"/>
+          <w:color w:val="777777"/>
+          <w:sz w:val="16"/>
+        </w:rPr>
+        <w:t>Patrón validado: número + verbo/consecuencia negativa + paréntesis contrapunto '(No Matter What You Earn)' — elimina la excusa de ingresos antes de que el viewer la piense.</w:t>
+      </w:r>
+    </w:p>
+    <w:p>
+      <w:pPr>
+        <w:spacing w:before="20" w:after="20"/>
+      </w:pPr>
+      <w:r>
+        <w:rPr>
+          <w:b w:val="0"/>
+          <w:color w:val="B02A2A"/>
+          <w:sz w:val="16"/>
+        </w:rPr>
+        <w:t>NO repite ningún título anterior (V1-V13 revisados). Diferenciado de V13 (rewires/neuroplasticidad) y de V12 (3 Reasons/Every Payday) — mismo tema payday, ángulo distinto: los 5 drenajes, no las 3 razones.</w:t>
+      </w:r>
+    </w:p>
+    <w:p>
+      <w:pPr>
+        <w:spacing w:before="120" w:after="40"/>
+      </w:pPr>
+      <w:r>
+        <w:rPr>
+          <w:color w:val="CCCCCC"/>
+          <w:sz w:val="14"/>
+        </w:rPr>
+        <w:t>──────────────────────────────────────────────────────────────────────────────────────────</w:t>
+      </w:r>
+    </w:p>
+    <w:p>
+      <w:pPr>
+        <w:spacing w:before="280" w:after="80"/>
+      </w:pPr>
+      <w:r>
+        <w:rPr>
+          <w:b/>
+          <w:color w:val="B02A2A"/>
+          <w:sz w:val="22"/>
+        </w:rPr>
+        <w:t>── 3. DESCRIPCIÓN — copia exactamente ──</w:t>
+      </w:r>
+    </w:p>
+    <w:p>
+      <w:pPr>
+        <w:spacing w:before="0" w:after="0"/>
         <w:ind w:left="283"/>
+      </w:pPr>
+      <w:r>
+        <w:rPr>
+          <w:sz w:val="18"/>
+        </w:rPr>
+        <w:t>Why does your money always disappear before payday? Not sometimes. Every month.</w:t>
+      </w:r>
+    </w:p>
+    <w:p>
+      <w:pPr>
+        <w:spacing w:before="0" w:after="0"/>
+        <w:ind w:left="283"/>
+      </w:pPr>
+      <w:r>
+        <w:rPr>
+          <w:sz w:val="18"/>
+        </w:rPr>
+      </w:r>
+    </w:p>
+    <w:p>
+      <w:pPr>
+        <w:spacing w:before="0" w:after="0"/>
+        <w:ind w:left="283"/>
+      </w:pPr>
+      <w:r>
+        <w:rPr>
+          <w:sz w:val="18"/>
+        </w:rPr>
+        <w:t>It doesn't matter if you earn €2,000 or €6,000. Four weeks. Same empty account.</w:t>
+      </w:r>
+    </w:p>
+    <w:p>
+      <w:pPr>
+        <w:spacing w:before="0" w:after="0"/>
+        <w:ind w:left="283"/>
+      </w:pPr>
+      <w:r>
+        <w:rPr>
+          <w:sz w:val="18"/>
+        </w:rPr>
+      </w:r>
+    </w:p>
+    <w:p>
+      <w:pPr>
+        <w:spacing w:before="0" w:after="0"/>
+        <w:ind w:left="283"/>
+      </w:pPr>
+      <w:r>
+        <w:rPr>
+          <w:sz w:val="18"/>
+        </w:rPr>
+        <w:t>5 things are draining your money before payday — and none of them feel like mistakes</w:t>
+      </w:r>
+    </w:p>
+    <w:p>
+      <w:pPr>
+        <w:spacing w:before="0" w:after="0"/>
+        <w:ind w:left="283"/>
+      </w:pPr>
+      <w:r>
+        <w:rPr>
+          <w:sz w:val="18"/>
+        </w:rPr>
+        <w:t>when they happen. The worst one runs before the money even arrives.</w:t>
+      </w:r>
+    </w:p>
+    <w:p>
+      <w:pPr>
+        <w:spacing w:before="0" w:after="0"/>
+        <w:ind w:left="283"/>
+      </w:pPr>
+      <w:r>
+        <w:rPr>
+          <w:sz w:val="18"/>
+        </w:rPr>
+      </w:r>
+    </w:p>
+    <w:p>
+      <w:pPr>
+        <w:spacing w:before="0" w:after="0"/>
+        <w:ind w:left="283"/>
+      </w:pPr>
+      <w:r>
+        <w:rPr>
+          <w:sz w:val="18"/>
+        </w:rPr>
+        <w:t>These aren't budgeting mistakes. They're not discipline failures.</w:t>
+      </w:r>
+    </w:p>
+    <w:p>
+      <w:pPr>
+        <w:spacing w:before="0" w:after="0"/>
+        <w:ind w:left="283"/>
+      </w:pPr>
+      <w:r>
+        <w:rPr>
+          <w:sz w:val="18"/>
+        </w:rPr>
+        <w:t>They're patterns. And they run automatically.</w:t>
+      </w:r>
+    </w:p>
+    <w:p>
+      <w:pPr>
+        <w:spacing w:before="0" w:after="0"/>
+        <w:ind w:left="283"/>
+      </w:pPr>
+      <w:r>
+        <w:rPr>
+          <w:sz w:val="18"/>
+        </w:rPr>
+      </w:r>
+    </w:p>
+    <w:p>
+      <w:pPr>
+        <w:spacing w:before="0" w:after="0"/>
+        <w:ind w:left="283"/>
+      </w:pPr>
+      <w:r>
+        <w:rPr>
+          <w:sz w:val="18"/>
+        </w:rPr>
+        <w:t>In this video:</w:t>
+      </w:r>
+    </w:p>
+    <w:p>
+      <w:pPr>
+        <w:spacing w:before="0" w:after="0"/>
+        <w:ind w:left="283"/>
+      </w:pPr>
+      <w:r>
+        <w:rPr>
+          <w:sz w:val="18"/>
+        </w:rPr>
+        <w:t>→ #5 — The Card Gap: why card payments silence the part of your brain that registers loss</w:t>
+      </w:r>
+    </w:p>
+    <w:p>
+      <w:pPr>
+        <w:spacing w:before="0" w:after="0"/>
+        <w:ind w:left="283"/>
+      </w:pPr>
+      <w:r>
+        <w:rPr>
+          <w:sz w:val="18"/>
+        </w:rPr>
+        <w:t>→ #4 — The Reward Drain: the sentence that has cost more than any impulse purchase</w:t>
+      </w:r>
+    </w:p>
+    <w:p>
+      <w:pPr>
+        <w:spacing w:before="0" w:after="0"/>
+        <w:ind w:left="283"/>
+      </w:pPr>
+      <w:r>
+        <w:rPr>
+          <w:sz w:val="18"/>
+        </w:rPr>
+        <w:t>→ #3 — The Invisible Drain: why your brain doesn't cancel things, it lets them run</w:t>
+      </w:r>
+    </w:p>
+    <w:p>
+      <w:pPr>
+        <w:spacing w:before="0" w:after="0"/>
+        <w:ind w:left="283"/>
+      </w:pPr>
+      <w:r>
+        <w:rPr>
+          <w:sz w:val="18"/>
+        </w:rPr>
+        <w:t>→ #2 — Social Spending: the most expensive audience in your life has never spent a dollar</w:t>
+      </w:r>
+    </w:p>
+    <w:p>
+      <w:pPr>
+        <w:spacing w:before="0" w:after="0"/>
+        <w:ind w:left="283"/>
+      </w:pPr>
+      <w:r>
+        <w:rPr>
+          <w:sz w:val="18"/>
+        </w:rPr>
+        <w:t>→ #1 — The Pre-Spend: the one nobody names. It runs before the money arrives.</w:t>
+      </w:r>
+    </w:p>
+    <w:p>
+      <w:pPr>
+        <w:spacing w:before="0" w:after="0"/>
+        <w:ind w:left="283"/>
+      </w:pPr>
+      <w:r>
+        <w:rPr>
+          <w:sz w:val="18"/>
+        </w:rPr>
+        <w:t>→ The structural fix for each drain — no willpower required</w:t>
+      </w:r>
+    </w:p>
+    <w:p>
+      <w:pPr>
+        <w:spacing w:before="0" w:after="0"/>
+        <w:ind w:left="283"/>
+      </w:pPr>
+      <w:r>
+        <w:rPr>
+          <w:sz w:val="18"/>
+        </w:rPr>
+      </w:r>
+    </w:p>
+    <w:p>
+      <w:pPr>
+        <w:spacing w:before="0" w:after="0"/>
+        <w:ind w:left="283"/>
+      </w:pPr>
+      <w:r>
+        <w:rPr>
+          <w:sz w:val="18"/>
+        </w:rPr>
+        <w:t>───────────────────────────────</w:t>
+      </w:r>
+    </w:p>
+    <w:p>
+      <w:pPr>
+        <w:spacing w:before="0" w:after="0"/>
+        <w:ind w:left="283"/>
+      </w:pPr>
+      <w:r>
+        <w:rPr>
+          <w:sz w:val="18"/>
+        </w:rPr>
+        <w:t>📌 Watch next → [PEGA AQUÍ URL DE V15 — 'the one decision that stops all five']</w:t>
+      </w:r>
+    </w:p>
+    <w:p>
+      <w:pPr>
+        <w:spacing w:before="0" w:after="0"/>
+        <w:ind w:left="283"/>
+      </w:pPr>
+      <w:r>
+        <w:rPr>
+          <w:sz w:val="18"/>
+        </w:rPr>
+        <w:t>📌 Previous: 5 Ways Your Brain Physically Rewires Itself to Stay Broke → [PEGA AQUÍ URL DE V13]</w:t>
+      </w:r>
+    </w:p>
+    <w:p>
+      <w:pPr>
+        <w:spacing w:before="0" w:after="0"/>
+        <w:ind w:left="283"/>
+      </w:pPr>
+      <w:r>
+        <w:rPr>
+          <w:sz w:val="18"/>
+        </w:rPr>
+        <w:t>───────────────────────────────</w:t>
+      </w:r>
+    </w:p>
+    <w:p>
+      <w:pPr>
+        <w:spacing w:before="0" w:after="0"/>
+        <w:ind w:left="283"/>
+      </w:pPr>
+      <w:r>
+        <w:rPr>
+          <w:sz w:val="18"/>
+        </w:rPr>
+      </w:r>
+    </w:p>
+    <w:p>
+      <w:pPr>
+        <w:spacing w:before="0" w:after="0"/>
+        <w:ind w:left="283"/>
+      </w:pPr>
+      <w:r>
+        <w:rPr>
+          <w:sz w:val="18"/>
+        </w:rPr>
+        <w:t>0:00 Why your money disappears before payday</w:t>
+      </w:r>
+    </w:p>
+    <w:p>
+      <w:pPr>
+        <w:spacing w:before="0" w:after="0"/>
+        <w:ind w:left="283"/>
+      </w:pPr>
+      <w:r>
+        <w:rPr>
+          <w:sz w:val="18"/>
+        </w:rPr>
+        <w:t>0:30 These aren't budgeting mistakes</w:t>
+      </w:r>
+    </w:p>
+    <w:p>
+      <w:pPr>
+        <w:spacing w:before="0" w:after="0"/>
+        <w:ind w:left="283"/>
+      </w:pPr>
+      <w:r>
+        <w:rPr>
+          <w:sz w:val="18"/>
+        </w:rPr>
+        <w:t>0:45 #5 — The Card Gap</w:t>
+      </w:r>
+    </w:p>
+    <w:p>
+      <w:pPr>
+        <w:spacing w:before="0" w:after="0"/>
+        <w:ind w:left="283"/>
+      </w:pPr>
+      <w:r>
+        <w:rPr>
+          <w:sz w:val="18"/>
+        </w:rPr>
+        <w:t>1:15 #4 — The Reward Drain</w:t>
+      </w:r>
+    </w:p>
+    <w:p>
+      <w:pPr>
+        <w:spacing w:before="0" w:after="0"/>
+        <w:ind w:left="283"/>
+      </w:pPr>
+      <w:r>
+        <w:rPr>
+          <w:sz w:val="18"/>
+        </w:rPr>
+        <w:t>1:45 #3 — The Invisible Drain</w:t>
+      </w:r>
+    </w:p>
+    <w:p>
+      <w:pPr>
+        <w:spacing w:before="0" w:after="0"/>
+        <w:ind w:left="283"/>
+      </w:pPr>
+      <w:r>
+        <w:rPr>
+          <w:sz w:val="18"/>
+        </w:rPr>
+        <w:t>2:15 CTA</w:t>
+      </w:r>
+    </w:p>
+    <w:p>
+      <w:pPr>
+        <w:spacing w:before="0" w:after="0"/>
+        <w:ind w:left="283"/>
+      </w:pPr>
+      <w:r>
+        <w:rPr>
+          <w:sz w:val="18"/>
+        </w:rPr>
+        <w:t>2:25 #2 — Social Spending</w:t>
+      </w:r>
+    </w:p>
+    <w:p>
+      <w:pPr>
+        <w:spacing w:before="0" w:after="0"/>
+        <w:ind w:left="283"/>
+      </w:pPr>
+      <w:r>
+        <w:rPr>
+          <w:sz w:val="18"/>
+        </w:rPr>
+        <w:t>2:55 #1 — The Pre-Spend (the one nobody names)</w:t>
+      </w:r>
+    </w:p>
+    <w:p>
+      <w:pPr>
+        <w:spacing w:before="0" w:after="0"/>
+        <w:ind w:left="283"/>
+      </w:pPr>
+      <w:r>
+        <w:rPr>
+          <w:sz w:val="18"/>
+        </w:rPr>
+        <w:t>3:40 Five patterns, running automatically</w:t>
+      </w:r>
+    </w:p>
+    <w:p>
+      <w:pPr>
+        <w:spacing w:before="0" w:after="0"/>
+        <w:ind w:left="283"/>
+      </w:pPr>
+      <w:r>
+        <w:rPr>
+          <w:sz w:val="18"/>
+        </w:rPr>
+        <w:t>4:00 The structural fix — one per drain</w:t>
+      </w:r>
+    </w:p>
+    <w:p>
+      <w:pPr>
+        <w:spacing w:before="0" w:after="0"/>
+        <w:ind w:left="283"/>
+      </w:pPr>
+      <w:r>
+        <w:rPr>
+          <w:sz w:val="18"/>
+        </w:rPr>
+        <w:t>4:40 Brain Villain's last trick</w:t>
+      </w:r>
+    </w:p>
+    <w:p>
+      <w:pPr>
+        <w:spacing w:before="0" w:after="0"/>
+        <w:ind w:left="283"/>
+      </w:pPr>
+      <w:r>
+        <w:rPr>
+          <w:sz w:val="18"/>
+        </w:rPr>
+        <w:t>5:20 You're not bad with money</w:t>
+      </w:r>
+    </w:p>
+    <w:p>
+      <w:pPr>
+        <w:spacing w:before="0" w:after="0"/>
+        <w:ind w:left="283"/>
+      </w:pPr>
+      <w:r>
+        <w:rPr>
+          <w:sz w:val="18"/>
+        </w:rPr>
+        <w:t>5:45 Next week: the one decision</w:t>
+      </w:r>
+    </w:p>
+    <w:p>
+      <w:pPr>
+        <w:spacing w:before="0" w:after="0"/>
+        <w:ind w:left="283"/>
+      </w:pPr>
+      <w:r>
+        <w:rPr>
+          <w:sz w:val="18"/>
+        </w:rPr>
+      </w:r>
+    </w:p>
+    <w:p>
+      <w:pPr>
+        <w:spacing w:before="0" w:after="0"/>
+        <w:ind w:left="283"/>
+      </w:pPr>
+      <w:r>
+        <w:rPr>
+          <w:sz w:val="18"/>
+        </w:rPr>
+        <w:t>(Timestamps aproximados — ajustar a duración real del vídeo montado)</w:t>
+      </w:r>
+    </w:p>
+    <w:p>
+      <w:pPr>
+        <w:spacing w:before="0" w:after="0"/>
+        <w:ind w:left="283"/>
+      </w:pPr>
+      <w:r>
+        <w:rPr>
+          <w:sz w:val="18"/>
+        </w:rPr>
+      </w:r>
+    </w:p>
+    <w:p>
+      <w:pPr>
+        <w:spacing w:before="0" w:after="0"/>
+        <w:ind w:left="283"/>
+      </w:pPr>
+      <w:r>
+        <w:rPr>
+          <w:sz w:val="18"/>
+        </w:rPr>
+        <w:t>#behavioralfinance #financialpsychology #psychologyofmoney #personalfinance #neurocents</w:t>
+      </w:r>
+    </w:p>
+    <w:p>
+      <w:pPr>
+        <w:spacing w:before="120" w:after="40"/>
+      </w:pPr>
+      <w:r>
+        <w:rPr>
+          <w:color w:val="CCCCCC"/>
+          <w:sz w:val="14"/>
+        </w:rPr>
+        <w:t>──────────────────────────────────────────────────────────────────────────────────────────</w:t>
+      </w:r>
+    </w:p>
+    <w:p>
+      <w:pPr>
+        <w:spacing w:before="280" w:after="80"/>
+      </w:pPr>
+      <w:r>
+        <w:rPr>
+          <w:b/>
+          <w:color w:val="B02A2A"/>
+          <w:sz w:val="22"/>
+        </w:rPr>
+        <w:t>── 4. TAGS — copia todo el bloque en YouTube Studio ──</w:t>
+      </w:r>
+    </w:p>
+    <w:p>
+      <w:pPr>
+        <w:ind w:left="283"/>
+      </w:pPr>
+      <w:r>
+        <w:rPr>
+          <w:color w:val="2C3E50"/>
+          <w:sz w:val="18"/>
+        </w:rPr>
+        <w:t>behavioral finance, financial psychology, psychology of money, why am I broke before payday, broke before payday, money psychology, brain and money, cognitive biases money, why money disappears, neuroscience finance, personal finance psychology, card gap, reward drain, invisible drain, social spending, pre-spend, money patterns, why you can't save money, financial behavior, money habits, brain villain, subscription drain, impulsive spending psychology, payday money gone, neurocents</w:t>
+      </w:r>
+    </w:p>
+    <w:p/>
+    <w:p>
+      <w:pPr>
+        <w:spacing w:before="20" w:after="20"/>
+      </w:pPr>
+      <w:r>
+        <w:rPr>
+          <w:b/>
+          <w:color w:val="777777"/>
+          <w:sz w:val="16"/>
+        </w:rPr>
+        <w:t>TOP KEYWORDS POR SCORE:</w:t>
+      </w:r>
+    </w:p>
+    <w:p>
+      <w:pPr>
+        <w:spacing w:before="0" w:after="20"/>
+        <w:ind w:left="283"/>
+      </w:pPr>
+      <w:r>
+        <w:rPr>
+          <w:sz w:val="16"/>
+        </w:rPr>
+        <w:t xml:space="preserve">behavioral finance              </w:t>
+      </w:r>
+      <w:r>
+        <w:rPr>
+          <w:color w:val="777777"/>
+          <w:sz w:val="16"/>
+        </w:rPr>
+        <w:t>98K/mes     24.2 comp.    75.0  ← primario</w:t>
+      </w:r>
+    </w:p>
+    <w:p>
+      <w:pPr>
+        <w:spacing w:before="0" w:after="20"/>
+        <w:ind w:left="283"/>
+      </w:pPr>
+      <w:r>
+        <w:rPr>
+          <w:sz w:val="16"/>
+        </w:rPr>
+        <w:t xml:space="preserve">financial psychology            </w:t>
+      </w:r>
+      <w:r>
+        <w:rPr>
+          <w:color w:val="777777"/>
+          <w:sz w:val="16"/>
+        </w:rPr>
+        <w:t>120K/mes    27 comp.      74.7  ← primario</w:t>
+      </w:r>
+    </w:p>
+    <w:p>
+      <w:pPr>
+        <w:spacing w:before="0" w:after="20"/>
+        <w:ind w:left="283"/>
+      </w:pPr>
+      <w:r>
+        <w:rPr>
+          <w:sz w:val="16"/>
+        </w:rPr>
+        <w:t xml:space="preserve">psychology of money             </w:t>
+      </w:r>
+      <w:r>
+        <w:rPr>
+          <w:color w:val="777777"/>
+          <w:sz w:val="16"/>
+        </w:rPr>
+        <w:t>731K/mes    57.5 comp.    69.5  ← alto volumen</w:t>
+      </w:r>
+    </w:p>
+    <w:p>
+      <w:pPr>
+        <w:spacing w:before="0" w:after="20"/>
+        <w:ind w:left="283"/>
+      </w:pPr>
+      <w:r>
+        <w:rPr>
+          <w:sz w:val="16"/>
+        </w:rPr>
+        <w:t xml:space="preserve">why can't I save money          </w:t>
+      </w:r>
+      <w:r>
+        <w:rPr>
+          <w:color w:val="777777"/>
+          <w:sz w:val="16"/>
+        </w:rPr>
+        <w:t>11.8K/mes   48.5 comp.    57.1</w:t>
+      </w:r>
+    </w:p>
+    <w:p>
+      <w:pPr>
+        <w:spacing w:before="0" w:after="20"/>
+        <w:ind w:left="283"/>
+      </w:pPr>
+      <w:r>
+        <w:rPr>
+          <w:sz w:val="16"/>
+        </w:rPr>
+        <w:t xml:space="preserve">why am I broke before payday    </w:t>
+      </w:r>
+      <w:r>
+        <w:rPr>
+          <w:color w:val="777777"/>
+          <w:sz w:val="16"/>
+        </w:rPr>
+        <w:t>testear     —             exact match título</w:t>
+      </w:r>
+    </w:p>
+    <w:p>
+      <w:pPr>
+        <w:spacing w:before="0" w:after="20"/>
+        <w:ind w:left="283"/>
+      </w:pPr>
+      <w:r>
+        <w:rPr>
+          <w:sz w:val="16"/>
+        </w:rPr>
+        <w:t xml:space="preserve">broke before payday             </w:t>
+      </w:r>
+      <w:r>
+        <w:rPr>
+          <w:color w:val="777777"/>
+          <w:sz w:val="16"/>
+        </w:rPr>
+        <w:t>testear     —             sector-wide S22</w:t>
+      </w:r>
+    </w:p>
+    <w:p>
+      <w:pPr>
+        <w:spacing w:before="0" w:after="20"/>
+        <w:ind w:left="283"/>
+      </w:pPr>
+      <w:r>
+        <w:rPr>
+          <w:sz w:val="16"/>
+        </w:rPr>
+        <w:t xml:space="preserve">cognitive biases money          </w:t>
+      </w:r>
+      <w:r>
+        <w:rPr>
+          <w:color w:val="777777"/>
+          <w:sz w:val="16"/>
+        </w:rPr>
+        <w:t>4.9K/mes    33.7 comp.    59.6</w:t>
+      </w:r>
+    </w:p>
+    <w:p>
+      <w:pPr>
+        <w:spacing w:before="0" w:after="20"/>
+        <w:ind w:left="283"/>
+      </w:pPr>
+      <w:r>
+        <w:rPr>
+          <w:sz w:val="16"/>
+        </w:rPr>
+        <w:t xml:space="preserve">neuroeconomics                  </w:t>
+      </w:r>
+      <w:r>
+        <w:rPr>
+          <w:color w:val="777777"/>
+          <w:sz w:val="16"/>
+        </w:rPr>
+        <w:t>6.9K/mes    27.2 comp.    63.5</w:t>
+      </w:r>
+    </w:p>
+    <w:p>
+      <w:pPr>
+        <w:spacing w:before="120" w:after="40"/>
+      </w:pPr>
+      <w:r>
+        <w:rPr>
+          <w:color w:val="CCCCCC"/>
+          <w:sz w:val="14"/>
+        </w:rPr>
+        <w:t>──────────────────────────────────────────────────────────────────────────────────────────</w:t>
+      </w:r>
+    </w:p>
+    <w:p>
+      <w:pPr>
+        <w:spacing w:before="280" w:after="80"/>
+      </w:pPr>
+      <w:r>
+        <w:rPr>
+          <w:b/>
+          <w:color w:val="B02A2A"/>
+          <w:sz w:val="22"/>
+        </w:rPr>
+        <w:t>── 5. MINIATURA — concepto BROKE / BEFORE / PAYDAY (fondo blanco, S23 aprobado) ──</w:t>
+      </w:r>
+    </w:p>
+    <w:p>
+      <w:pPr>
+        <w:spacing w:before="20" w:after="40"/>
       </w:pPr>
       <w:r>
         <w:rPr>
@@ -106,20 +880,18 @@
           <w:color w:val="777777"/>
           <w:sz w:val="18"/>
         </w:rPr>
-        <w:t xml:space="preserve">TITLE (alt B): </w:t>
+        <w:t xml:space="preserve">CONCEPTO:  </w:t>
       </w:r>
       <w:r>
         <w:rPr>
-          <w:color w:val="2C3E50"/>
           <w:sz w:val="20"/>
         </w:rPr>
-        <w:t>Why You're Broke Before Payday — 5 Things Your Brain Does</w:t>
+        <w:t>Alex sosteniendo teléfono con saldo €0.00, boca abierta en shock genuino. Brain Villain dentro del cráneo transparente, brazos cruzados, satisfecho.</w:t>
       </w:r>
     </w:p>
     <w:p>
       <w:pPr>
-        <w:spacing w:before="40" w:after="40"/>
-        <w:ind w:left="283"/>
+        <w:spacing w:before="20" w:after="40"/>
       </w:pPr>
       <w:r>
         <w:rPr>
@@ -127,20 +899,18 @@
           <w:color w:val="777777"/>
           <w:sz w:val="18"/>
         </w:rPr>
-        <w:t xml:space="preserve">Hook Strategy: </w:t>
+        <w:t xml:space="preserve">FONDO:  </w:t>
       </w:r>
       <w:r>
         <w:rPr>
-          <w:color w:val="2C3E50"/>
           <w:sz w:val="20"/>
         </w:rPr>
-        <w:t>S1 — Pregunta Sin Resolver (Zeigarnik Effect)</w:t>
+        <w:t>BLANCO puro — estilo Andy/MoneyTom. NO oscuro, NO gradiente.</w:t>
       </w:r>
     </w:p>
     <w:p>
       <w:pPr>
-        <w:spacing w:before="40" w:after="40"/>
-        <w:ind w:left="283"/>
+        <w:spacing w:before="20" w:after="40"/>
       </w:pPr>
       <w:r>
         <w:rPr>
@@ -148,20 +918,18 @@
           <w:color w:val="777777"/>
           <w:sz w:val="18"/>
         </w:rPr>
-        <w:t xml:space="preserve">Format: </w:t>
+        <w:t xml:space="preserve">TEXTO THUMBNAIL:  </w:t>
       </w:r>
       <w:r>
         <w:rPr>
-          <w:color w:val="2C3E50"/>
           <w:sz w:val="20"/>
         </w:rPr>
-        <w:t>Lista con Ranking (5 → 1), sector-wide topic, no scientific data</w:t>
+        <w:t>BROKE / BEFORE / PAYDAY — stacked, BROKE y BEFORE en negro, PAYDAY en rojo (#C62828)</w:t>
       </w:r>
     </w:p>
     <w:p>
       <w:pPr>
-        <w:spacing w:before="40" w:after="40"/>
-        <w:ind w:left="283"/>
+        <w:spacing w:before="20" w:after="40"/>
       </w:pPr>
       <w:r>
         <w:rPr>
@@ -169,20 +937,18 @@
           <w:color w:val="777777"/>
           <w:sz w:val="18"/>
         </w:rPr>
-        <w:t xml:space="preserve">Beat Count: </w:t>
+        <w:t xml:space="preserve">OBJETO:  </w:t>
       </w:r>
       <w:r>
         <w:rPr>
-          <w:color w:val="2C3E50"/>
           <w:sz w:val="20"/>
         </w:rPr>
-        <w:t>95 beats (~8–10 min)</w:t>
+        <w:t>Teléfono con €0.00 en rojo grande + 'AVAILABLE BALANCE' — prop que confirma S17 continuity</w:t>
       </w:r>
     </w:p>
     <w:p>
       <w:pPr>
-        <w:spacing w:before="40" w:after="40"/>
-        <w:ind w:left="283"/>
+        <w:spacing w:before="20" w:after="40"/>
       </w:pPr>
       <w:r>
         <w:rPr>
@@ -190,33 +956,986 @@
           <w:color w:val="777777"/>
           <w:sz w:val="18"/>
         </w:rPr>
-        <w:t xml:space="preserve">Keyword target: </w:t>
+        <w:t xml:space="preserve">EXPRESIÓN ALEX:  </w:t>
       </w:r>
+      <w:r>
+        <w:rPr>
+          <w:sz w:val="20"/>
+        </w:rPr>
+        <w:t>Boca ABIERTA en shock/dread genuino, ojos grandes — legible a 200px (S23 regla). Neutral/flat = rechazar y regenerar.</w:t>
+      </w:r>
+    </w:p>
+    <w:p>
+      <w:pPr>
+        <w:spacing w:before="20" w:after="20"/>
+      </w:pPr>
+      <w:r>
+        <w:rPr>
+          <w:b w:val="0"/>
+          <w:color w:val="B02A2A"/>
+          <w:sz w:val="16"/>
+        </w:rPr>
+        <w:t>■ Blue t-shirt en Alex — NO red. Verificar SIEMPRE en Google Flow antes de generar.</w:t>
+      </w:r>
+    </w:p>
+    <w:p>
+      <w:pPr>
+        <w:spacing w:before="20" w:after="20"/>
+      </w:pPr>
+      <w:r>
+        <w:rPr>
+          <w:b w:val="0"/>
+          <w:color w:val="B02A2A"/>
+          <w:sz w:val="16"/>
+        </w:rPr>
+        <w:t>■ Gray pants — NO jeans, NO blue pants. Corrección de la primera iteración (S23).</w:t>
+      </w:r>
+    </w:p>
+    <w:p>
+      <w:pPr>
+        <w:spacing w:before="20" w:after="20"/>
+      </w:pPr>
+      <w:r>
+        <w:rPr>
+          <w:b w:val="0"/>
+          <w:color w:val="B02A2A"/>
+          <w:sz w:val="16"/>
+        </w:rPr>
+        <w:t>■ Brain Villain DENTRO del cráneo transparente — NO flotando fuera. Regla absoluta.</w:t>
+      </w:r>
+    </w:p>
+    <w:p>
+      <w:pPr>
+        <w:spacing w:before="20" w:after="20"/>
+      </w:pPr>
+      <w:r>
+        <w:rPr>
+          <w:b w:val="0"/>
+          <w:color w:val="1A7A3C"/>
+          <w:sz w:val="16"/>
+        </w:rPr>
+        <w:t>APROBADO tras 2 iteraciones en Google Flow (ver S23 en CLAUDE.md) — variante final con boca abierta y contraste alto es la que se sube.</w:t>
+      </w:r>
+    </w:p>
+    <w:p/>
+    <w:p>
+      <w:pPr>
+        <w:spacing w:before="20" w:after="20"/>
+      </w:pPr>
+      <w:r>
+        <w:rPr>
+          <w:b/>
+          <w:color w:val="777777"/>
+          <w:sz w:val="16"/>
+        </w:rPr>
+        <w:t>DESCARTADO — variante alternativa 'grid de iconos sin personaje':</w:t>
+      </w:r>
+    </w:p>
+    <w:p>
+      <w:pPr>
+        <w:spacing w:before="20" w:after="20"/>
+      </w:pPr>
+      <w:r>
+        <w:rPr>
+          <w:b w:val="0"/>
+          <w:color w:val="777777"/>
+          <w:sz w:val="16"/>
+        </w:rPr>
+        <w:t>Se probó un formato viral tipo listicle (5 iconos de color, sin Alex) inspirado en outliers de 'Cada Droga Explicada' / 'Técnicas de Manipulación'. Test a 200px: las 5 etiquetas y el detalle de cada icono se volvían ilegibles. Se descarta como miniatura principal — queda como asset opcional para Reddit o capítulos de descripción, donde sí se ve a tamaño completo.</w:t>
+      </w:r>
+    </w:p>
+    <w:p>
+      <w:pPr>
+        <w:spacing w:before="120" w:after="40"/>
+      </w:pPr>
+      <w:r>
+        <w:rPr>
+          <w:color w:val="CCCCCC"/>
+          <w:sz w:val="14"/>
+        </w:rPr>
+        <w:t>──────────────────────────────────────────────────────────────────────────────────────────</w:t>
+      </w:r>
+    </w:p>
+    <w:p>
+      <w:pPr>
+        <w:spacing w:before="280" w:after="80"/>
+      </w:pPr>
+      <w:r>
+        <w:rPr>
+          <w:b/>
+          <w:color w:val="B02A2A"/>
+          <w:sz w:val="22"/>
+        </w:rPr>
+        <w:t>── 6. YOUTUBE STUDIO — configuración antes de publicar ──</w:t>
+      </w:r>
+    </w:p>
+    <w:p>
+      <w:pPr>
+        <w:spacing w:before="20" w:after="40"/>
+        <w:ind w:left="170"/>
+      </w:pPr>
+      <w:r>
+        <w:rPr>
+          <w:sz w:val="20"/>
+        </w:rPr>
+        <w:t>☐  Título:         5 Things That Drain Your Money Before Payday (No Matter What You Earn)</w:t>
+      </w:r>
+    </w:p>
+    <w:p>
+      <w:pPr>
+        <w:spacing w:before="20" w:after="40"/>
+        <w:ind w:left="170"/>
+      </w:pPr>
+      <w:r>
+        <w:rPr>
+          <w:sz w:val="20"/>
+        </w:rPr>
+        <w:t>☐  Descripción:    Pegada completa — 5 items + timestamps + URLs V13 y V15</w:t>
+      </w:r>
+    </w:p>
+    <w:p>
+      <w:pPr>
+        <w:spacing w:before="20" w:after="40"/>
+        <w:ind w:left="170"/>
+      </w:pPr>
+      <w:r>
+        <w:rPr>
+          <w:sz w:val="20"/>
+        </w:rPr>
+        <w:t>☐  Tags:           Todos pegados (ver sección 4)</w:t>
+      </w:r>
+    </w:p>
+    <w:p>
+      <w:pPr>
+        <w:spacing w:before="20" w:after="40"/>
+        <w:ind w:left="170"/>
+      </w:pPr>
+      <w:r>
+        <w:rPr>
+          <w:sz w:val="20"/>
+        </w:rPr>
+        <w:t>☐  Categoría:      Education</w:t>
+      </w:r>
+    </w:p>
+    <w:p>
+      <w:pPr>
+        <w:spacing w:before="20" w:after="40"/>
+        <w:ind w:left="170"/>
+      </w:pPr>
+      <w:r>
+        <w:rPr>
+          <w:sz w:val="20"/>
+        </w:rPr>
+        <w:t>☐  Miniatura:      Subida — Alex shock + €0.00 + BROKE/BEFORE/PAYDAY, fondo blanco</w:t>
+      </w:r>
+    </w:p>
+    <w:p>
+      <w:pPr>
+        <w:spacing w:before="20" w:after="40"/>
+        <w:ind w:left="170"/>
+      </w:pPr>
+      <w:r>
+        <w:rPr>
+          <w:sz w:val="20"/>
+        </w:rPr>
+        <w:t>☐  Capítulos:      Activados (timestamps en descripción — ajustar al vídeo real)</w:t>
+      </w:r>
+    </w:p>
+    <w:p>
+      <w:pPr>
+        <w:spacing w:before="20" w:after="40"/>
+        <w:ind w:left="170"/>
+      </w:pPr>
+      <w:r>
+        <w:rPr>
+          <w:sz w:val="20"/>
+        </w:rPr>
+        <w:t>☐  Subtítulos:     Auto-generados por YouTube (dejar activado)</w:t>
+      </w:r>
+    </w:p>
+    <w:p>
+      <w:pPr>
+        <w:spacing w:before="20" w:after="40"/>
+        <w:ind w:left="170"/>
+      </w:pPr>
+      <w:r>
+        <w:rPr>
+          <w:sz w:val="20"/>
+        </w:rPr>
+        <w:t>☐  Visibilidad:    Público — programado JUEVES 20:15 CEST (= 14:15 EST)</w:t>
+      </w:r>
+    </w:p>
+    <w:p>
+      <w:pPr>
+        <w:spacing w:before="20" w:after="40"/>
+        <w:ind w:left="170"/>
+      </w:pPr>
+      <w:r>
+        <w:rPr>
+          <w:sz w:val="20"/>
+        </w:rPr>
+        <w:t>☐  Marca de agua:  Neurocents_Watermark.png subida en Studio</w:t>
+      </w:r>
+    </w:p>
+    <w:p>
+      <w:pPr>
+        <w:spacing w:before="120" w:after="40"/>
+      </w:pPr>
+      <w:r>
+        <w:rPr>
+          <w:color w:val="CCCCCC"/>
+          <w:sz w:val="14"/>
+        </w:rPr>
+        <w:t>──────────────────────────────────────────────────────────────────────────────────────────</w:t>
+      </w:r>
+    </w:p>
+    <w:p>
+      <w:pPr>
+        <w:spacing w:before="280" w:after="80"/>
+      </w:pPr>
+      <w:r>
+        <w:rPr>
+          <w:b/>
+          <w:color w:val="B02A2A"/>
+          <w:sz w:val="22"/>
+        </w:rPr>
+        <w:t>── 7. END SCREEN — últimos 20 segundos ──</w:t>
+      </w:r>
+    </w:p>
+    <w:p>
+      <w:pPr>
+        <w:spacing w:before="20" w:after="40"/>
+        <w:ind w:left="170"/>
+      </w:pPr>
+      <w:r>
+        <w:rPr>
+          <w:sz w:val="20"/>
+        </w:rPr>
+        <w:t>☐  Vídeo: seleccionar V13 (mientras V15 no esté publicado) — NO 'mejor opción automática'</w:t>
+      </w:r>
+    </w:p>
+    <w:p>
+      <w:pPr>
+        <w:spacing w:before="20" w:after="40"/>
+        <w:ind w:left="170"/>
+      </w:pPr>
+      <w:r>
+        <w:rPr>
+          <w:sz w:val="20"/>
+        </w:rPr>
+        <w:t>☐  Botón suscripción</w:t>
+      </w:r>
+    </w:p>
+    <w:p/>
+    <w:p>
+      <w:pPr>
+        <w:spacing w:before="20" w:after="20"/>
+      </w:pPr>
+      <w:r>
+        <w:rPr>
+          <w:b/>
+          <w:color w:val="2C3E50"/>
+          <w:sz w:val="18"/>
+        </w:rPr>
+        <w:t>Script end screen:</w:t>
+      </w:r>
+    </w:p>
+    <w:p>
+      <w:pPr>
+        <w:spacing w:before="20" w:after="20"/>
+        <w:ind w:left="283"/>
+      </w:pPr>
+      <w:r>
+        <w:rPr>
+          <w:b w:val="0"/>
+          <w:sz w:val="18"/>
+        </w:rPr>
+        <w:t>'Next week — the one decision that stops all five. Not five solutions. One. Made once. Before the patterns activate. See you Thursday.'</w:t>
+      </w:r>
+    </w:p>
+    <w:p/>
+    <w:p>
+      <w:pPr>
+        <w:spacing w:before="20" w:after="20"/>
+      </w:pPr>
+      <w:r>
+        <w:rPr>
+          <w:b w:val="0"/>
+          <w:color w:val="B02A2A"/>
+          <w:sz w:val="16"/>
+        </w:rPr>
+        <w:t>⚠ CRÍTICO — dependencia con V15: en cuanto V15 esté publicado, entrar aquí y actualizar el end screen de V14 para que apunte a V15 específicamente. Es el payoff del tease — cerrar el loop.</w:t>
+      </w:r>
+    </w:p>
+    <w:p>
+      <w:pPr>
+        <w:spacing w:before="120" w:after="40"/>
+      </w:pPr>
+      <w:r>
+        <w:rPr>
+          <w:color w:val="CCCCCC"/>
+          <w:sz w:val="14"/>
+        </w:rPr>
+        <w:t>──────────────────────────────────────────────────────────────────────────────────────────</w:t>
+      </w:r>
+    </w:p>
+    <w:p>
+      <w:pPr>
+        <w:spacing w:before="280" w:after="80"/>
+      </w:pPr>
+      <w:r>
+        <w:rPr>
+          <w:b/>
+          <w:color w:val="B02A2A"/>
+          <w:sz w:val="22"/>
+        </w:rPr>
+        <w:t>── 8. CARDS (tarjetas dentro del vídeo) ──</w:t>
+      </w:r>
+    </w:p>
+    <w:p>
+      <w:pPr>
+        <w:spacing w:before="20" w:after="40"/>
+        <w:ind w:left="170"/>
+      </w:pPr>
+      <w:r>
+        <w:rPr>
+          <w:sz w:val="20"/>
+        </w:rPr>
+        <w:t>☐  Minuto ~2:15 (CTA) → card apuntando a V13 (contexto de trilogía — 5 Ways Rewires)</w:t>
+      </w:r>
+    </w:p>
+    <w:p>
+      <w:pPr>
+        <w:spacing w:before="20" w:after="40"/>
+        <w:ind w:left="170"/>
+      </w:pPr>
+      <w:r>
+        <w:rPr>
+          <w:sz w:val="20"/>
+        </w:rPr>
+        <w:t>☐  Minuto ~4:40 (Brain Villain's Last Trick) → card apuntando a V12 (Why Willpower Fails — tema hermano)</w:t>
+      </w:r>
+    </w:p>
+    <w:p>
+      <w:pPr>
+        <w:spacing w:before="120" w:after="40"/>
+      </w:pPr>
+      <w:r>
+        <w:rPr>
+          <w:color w:val="CCCCCC"/>
+          <w:sz w:val="14"/>
+        </w:rPr>
+        <w:t>──────────────────────────────────────────────────────────────────────────────────────────</w:t>
+      </w:r>
+    </w:p>
+    <w:p>
+      <w:pPr>
+        <w:spacing w:before="280" w:after="80"/>
+      </w:pPr>
+      <w:r>
+        <w:rPr>
+          <w:b/>
+          <w:color w:val="B02A2A"/>
+          <w:sz w:val="22"/>
+        </w:rPr>
+        <w:t>── 9. PLAYLIST ──</w:t>
+      </w:r>
+    </w:p>
+    <w:p>
+      <w:pPr>
+        <w:spacing w:before="20" w:after="40"/>
+        <w:ind w:left="170"/>
+      </w:pPr>
+      <w:r>
+        <w:rPr>
+          <w:sz w:val="20"/>
+        </w:rPr>
+        <w:t>☐  Añadir V14 a playlist 'How Your Brain Costs You Money — Neurocents'</w:t>
+      </w:r>
+    </w:p>
+    <w:p>
+      <w:pPr>
+        <w:spacing w:before="20" w:after="40"/>
+        <w:ind w:left="170"/>
+      </w:pPr>
+      <w:r>
+        <w:rPr>
+          <w:sz w:val="20"/>
+        </w:rPr>
+        <w:t>☐  Orden secuencial: V13 → V14 → V15 (trilogía 5 rewires → 5 drains → the one fix)</w:t>
+      </w:r>
+    </w:p>
+    <w:p>
+      <w:pPr>
+        <w:spacing w:before="20" w:after="40"/>
+        <w:ind w:left="170"/>
+      </w:pPr>
+      <w:r>
+        <w:rPr>
+          <w:sz w:val="20"/>
+        </w:rPr>
+        <w:t>☐  Pegar URL de playlist en descripción de V14</w:t>
+      </w:r>
+    </w:p>
+    <w:p>
+      <w:pPr>
+        <w:spacing w:before="120" w:after="40"/>
+      </w:pPr>
+      <w:r>
+        <w:rPr>
+          <w:color w:val="CCCCCC"/>
+          <w:sz w:val="14"/>
+        </w:rPr>
+        <w:t>──────────────────────────────────────────────────────────────────────────────────────────</w:t>
+      </w:r>
+    </w:p>
+    <w:p>
+      <w:pPr>
+        <w:spacing w:before="280" w:after="80"/>
+      </w:pPr>
+      <w:r>
+        <w:rPr>
+          <w:b/>
+          <w:color w:val="B02A2A"/>
+          <w:sz w:val="22"/>
+        </w:rPr>
+        <w:t>── 10. PRIMER COMENTARIO — fijar nada más publicar (inmediatamente) ──</w:t>
+      </w:r>
+    </w:p>
+    <w:p>
+      <w:pPr>
+        <w:ind w:left="283"/>
+      </w:pPr>
       <w:r>
         <w:rPr>
           <w:color w:val="2C3E50"/>
           <w:sz w:val="20"/>
         </w:rPr>
-        <w:t>behavioral finance / psychology of money / financial psychology</w:t>
+        <w:t>Which of the 5 hit you hardest?</w:t>
+        <w:br/>
+        <w:br/>
+        <w:t>For me it's always been number 4 — the Reward Drain.</w:t>
+        <w:br/>
+        <w:t>The math the brain does on a brutal Thursday is frighteningly fast.</w:t>
+        <w:br/>
+        <w:t>Drop yours below 👇</w:t>
+        <w:br/>
+        <w:br/>
+        <w:t>(Number 1 — the Pre-Spend — is the one nobody names. That's the one that changed how I see payday.)</w:t>
       </w:r>
     </w:p>
     <w:p>
       <w:pPr>
-        <w:spacing w:before="280" w:after="60"/>
+        <w:spacing w:before="120" w:after="40"/>
+      </w:pPr>
+      <w:r>
+        <w:rPr>
+          <w:color w:val="CCCCCC"/>
+          <w:sz w:val="14"/>
+        </w:rPr>
+        <w:t>──────────────────────────────────────────────────────────────────────────────────────────</w:t>
+      </w:r>
+    </w:p>
+    <w:p>
+      <w:pPr>
+        <w:spacing w:before="280" w:after="80"/>
       </w:pPr>
       <w:r>
         <w:rPr>
           <w:b/>
           <w:color w:val="B02A2A"/>
-          <w:sz w:val="20"/>
+          <w:sz w:val="22"/>
         </w:rPr>
-        <w:t>── YOUTUBE DESCRIPTION ──</w:t>
+        <w:t>── 11. REDDIT — publicar 1h después de que el vídeo esté live ──</w:t>
       </w:r>
     </w:p>
     <w:p>
       <w:pPr>
-        <w:spacing w:before="80" w:after="40"/>
+        <w:spacing w:before="20" w:after="20"/>
         <w:ind w:left="283"/>
+      </w:pPr>
+      <w:r>
+        <w:rPr>
+          <w:b/>
+          <w:sz w:val="18"/>
+        </w:rPr>
+        <w:t xml:space="preserve">r/personalfinance               </w:t>
+      </w:r>
+      <w:r>
+        <w:rPr>
+          <w:color w:val="777777"/>
+          <w:sz w:val="16"/>
+        </w:rPr>
+        <w:t>Primero — ángulo de los 5 patrones automáticos, muy activo</w:t>
+      </w:r>
+    </w:p>
+    <w:p>
+      <w:pPr>
+        <w:spacing w:before="20" w:after="20"/>
+        <w:ind w:left="283"/>
+      </w:pPr>
+      <w:r>
+        <w:rPr>
+          <w:b/>
+          <w:sz w:val="18"/>
+        </w:rPr>
+        <w:t xml:space="preserve">r/povertyfinance                </w:t>
+      </w:r>
+      <w:r>
+        <w:rPr>
+          <w:color w:val="777777"/>
+          <w:sz w:val="16"/>
+        </w:rPr>
+        <w:t>+30 min — el dato de que la timing no cambia con el ingreso</w:t>
+      </w:r>
+    </w:p>
+    <w:p>
+      <w:pPr>
+        <w:spacing w:before="20" w:after="20"/>
+        <w:ind w:left="283"/>
+      </w:pPr>
+      <w:r>
+        <w:rPr>
+          <w:b/>
+          <w:sz w:val="18"/>
+        </w:rPr>
+        <w:t xml:space="preserve">r/psychology                    </w:t>
+      </w:r>
+      <w:r>
+        <w:rPr>
+          <w:color w:val="777777"/>
+          <w:sz w:val="16"/>
+        </w:rPr>
+        <w:t>+30 min — Card Gap / dolor de pago cash vs card</w:t>
+      </w:r>
+    </w:p>
+    <w:p>
+      <w:pPr>
+        <w:spacing w:before="20" w:after="20"/>
+        <w:ind w:left="283"/>
+      </w:pPr>
+      <w:r>
+        <w:rPr>
+          <w:b/>
+          <w:sz w:val="18"/>
+        </w:rPr>
+        <w:t xml:space="preserve">r/cogsci                        </w:t>
+      </w:r>
+      <w:r>
+        <w:rPr>
+          <w:color w:val="777777"/>
+          <w:sz w:val="16"/>
+        </w:rPr>
+        <w:t>+30 min — Pre-Spend / asignación mental antes del ingreso</w:t>
+      </w:r>
+    </w:p>
+    <w:p/>
+    <w:p>
+      <w:pPr>
+        <w:spacing w:before="20" w:after="20"/>
+      </w:pPr>
+      <w:r>
+        <w:rPr>
+          <w:b w:val="0"/>
+          <w:color w:val="B02A2A"/>
+          <w:sz w:val="16"/>
+        </w:rPr>
+        <w:t>FORMATO REDDIT: 150-200 palabras · aporta valor · menciona el vídeo al final de forma natural · no spam</w:t>
+      </w:r>
+    </w:p>
+    <w:p/>
+    <w:p>
+      <w:pPr>
+        <w:spacing w:before="20" w:after="20"/>
+      </w:pPr>
+      <w:r>
+        <w:rPr>
+          <w:b/>
+          <w:color w:val="2C3E50"/>
+          <w:sz w:val="18"/>
+        </w:rPr>
+        <w:t>BORRADOR r/personalfinance:</w:t>
+      </w:r>
+    </w:p>
+    <w:p>
+      <w:pPr>
+        <w:spacing w:before="0" w:after="0"/>
+        <w:ind w:left="283"/>
+      </w:pPr>
+      <w:r>
+        <w:rPr>
+          <w:sz w:val="16"/>
+        </w:rPr>
+      </w:r>
+    </w:p>
+    <w:p>
+      <w:pPr>
+        <w:spacing w:before="0" w:after="0"/>
+        <w:ind w:left="283"/>
+      </w:pPr>
+      <w:r>
+        <w:rPr>
+          <w:sz w:val="16"/>
+        </w:rPr>
+        <w:t>Title: The reason you're broke before payday isn't what you think</w:t>
+      </w:r>
+    </w:p>
+    <w:p>
+      <w:pPr>
+        <w:spacing w:before="0" w:after="0"/>
+        <w:ind w:left="283"/>
+      </w:pPr>
+      <w:r>
+        <w:rPr>
+          <w:sz w:val="16"/>
+        </w:rPr>
+      </w:r>
+    </w:p>
+    <w:p>
+      <w:pPr>
+        <w:spacing w:before="0" w:after="0"/>
+        <w:ind w:left="283"/>
+      </w:pPr>
+      <w:r>
+        <w:rPr>
+          <w:sz w:val="16"/>
+        </w:rPr>
+        <w:t>I spent a while mapping why money disappears before payday — not sometimes, but every</w:t>
+      </w:r>
+    </w:p>
+    <w:p>
+      <w:pPr>
+        <w:spacing w:before="0" w:after="0"/>
+        <w:ind w:left="283"/>
+      </w:pPr>
+      <w:r>
+        <w:rPr>
+          <w:sz w:val="16"/>
+        </w:rPr>
+        <w:t>single month — even when income goes up.</w:t>
+      </w:r>
+    </w:p>
+    <w:p>
+      <w:pPr>
+        <w:spacing w:before="0" w:after="0"/>
+        <w:ind w:left="283"/>
+      </w:pPr>
+      <w:r>
+        <w:rPr>
+          <w:sz w:val="16"/>
+        </w:rPr>
+      </w:r>
+    </w:p>
+    <w:p>
+      <w:pPr>
+        <w:spacing w:before="0" w:after="0"/>
+        <w:ind w:left="283"/>
+      </w:pPr>
+      <w:r>
+        <w:rPr>
+          <w:sz w:val="16"/>
+        </w:rPr>
+        <w:t>Turned out it wasn't budgeting failures. It was 5 specific patterns that run automatically.</w:t>
+      </w:r>
+    </w:p>
+    <w:p>
+      <w:pPr>
+        <w:spacing w:before="0" w:after="0"/>
+        <w:ind w:left="283"/>
+      </w:pPr>
+      <w:r>
+        <w:rPr>
+          <w:sz w:val="16"/>
+        </w:rPr>
+        <w:t>The worst one activates before the money even arrives — your brain allocates the salary</w:t>
+      </w:r>
+    </w:p>
+    <w:p>
+      <w:pPr>
+        <w:spacing w:before="0" w:after="0"/>
+        <w:ind w:left="283"/>
+      </w:pPr>
+      <w:r>
+        <w:rPr>
+          <w:sz w:val="16"/>
+        </w:rPr>
+        <w:t>mentally days before it lands, so by payday you're just confirming a decision you already made.</w:t>
+      </w:r>
+    </w:p>
+    <w:p>
+      <w:pPr>
+        <w:spacing w:before="0" w:after="0"/>
+        <w:ind w:left="283"/>
+      </w:pPr>
+      <w:r>
+        <w:rPr>
+          <w:sz w:val="16"/>
+        </w:rPr>
+      </w:r>
+    </w:p>
+    <w:p>
+      <w:pPr>
+        <w:spacing w:before="0" w:after="0"/>
+        <w:ind w:left="283"/>
+      </w:pPr>
+      <w:r>
+        <w:rPr>
+          <w:sz w:val="16"/>
+        </w:rPr>
+        <w:t>The five: Card Gap, Reward Drain, Invisible Drain, Social Spending, and the Pre-Spend.</w:t>
+      </w:r>
+    </w:p>
+    <w:p>
+      <w:pPr>
+        <w:spacing w:before="0" w:after="0"/>
+        <w:ind w:left="283"/>
+      </w:pPr>
+      <w:r>
+        <w:rPr>
+          <w:sz w:val="16"/>
+        </w:rPr>
+        <w:t>None of them feel like mistakes when they happen. That's what makes them effective.</w:t>
+      </w:r>
+    </w:p>
+    <w:p>
+      <w:pPr>
+        <w:spacing w:before="0" w:after="0"/>
+        <w:ind w:left="283"/>
+      </w:pPr>
+      <w:r>
+        <w:rPr>
+          <w:sz w:val="16"/>
+        </w:rPr>
+      </w:r>
+    </w:p>
+    <w:p>
+      <w:pPr>
+        <w:spacing w:before="0" w:after="0"/>
+        <w:ind w:left="283"/>
+      </w:pPr>
+      <w:r>
+        <w:rPr>
+          <w:sz w:val="16"/>
+        </w:rPr>
+        <w:t>Made a video going through all five and the structural fix for each: [URL]</w:t>
+      </w:r>
+    </w:p>
+    <w:p>
+      <w:pPr>
+        <w:spacing w:before="0" w:after="0"/>
+        <w:ind w:left="283"/>
+      </w:pPr>
+      <w:r>
+        <w:rPr>
+          <w:sz w:val="16"/>
+        </w:rPr>
+      </w:r>
+    </w:p>
+    <w:p>
+      <w:pPr>
+        <w:spacing w:before="0" w:after="0"/>
+        <w:ind w:left="283"/>
+      </w:pPr>
+      <w:r>
+        <w:rPr>
+          <w:sz w:val="16"/>
+        </w:rPr>
+        <w:t>Curious if others recognize any of these. Number 4 — the Reward Drain — seems to be universal.</w:t>
+      </w:r>
+    </w:p>
+    <w:p/>
+    <w:p>
+      <w:pPr>
+        <w:spacing w:before="20" w:after="20"/>
+      </w:pPr>
+      <w:r>
+        <w:rPr>
+          <w:b/>
+          <w:color w:val="2C3E50"/>
+          <w:sz w:val="18"/>
+        </w:rPr>
+        <w:t>BORRADOR r/povertyfinance:</w:t>
+      </w:r>
+    </w:p>
+    <w:p>
+      <w:pPr>
+        <w:spacing w:before="0" w:after="0"/>
+        <w:ind w:left="283"/>
+      </w:pPr>
+      <w:r>
+        <w:rPr>
+          <w:sz w:val="16"/>
+        </w:rPr>
+      </w:r>
+    </w:p>
+    <w:p>
+      <w:pPr>
+        <w:spacing w:before="0" w:after="0"/>
+        <w:ind w:left="283"/>
+      </w:pPr>
+      <w:r>
+        <w:rPr>
+          <w:sz w:val="16"/>
+        </w:rPr>
+        <w:t>Title: 5 things that drain money before payday — regardless of income level</w:t>
+      </w:r>
+    </w:p>
+    <w:p>
+      <w:pPr>
+        <w:spacing w:before="0" w:after="0"/>
+        <w:ind w:left="283"/>
+      </w:pPr>
+      <w:r>
+        <w:rPr>
+          <w:sz w:val="16"/>
+        </w:rPr>
+      </w:r>
+    </w:p>
+    <w:p>
+      <w:pPr>
+        <w:spacing w:before="0" w:after="0"/>
+        <w:ind w:left="283"/>
+      </w:pPr>
+      <w:r>
+        <w:rPr>
+          <w:sz w:val="16"/>
+        </w:rPr>
+        <w:t>One thing I kept noticing: the timing doesn't change with income.</w:t>
+      </w:r>
+    </w:p>
+    <w:p>
+      <w:pPr>
+        <w:spacing w:before="0" w:after="0"/>
+        <w:ind w:left="283"/>
+      </w:pPr>
+      <w:r>
+        <w:rPr>
+          <w:sz w:val="16"/>
+        </w:rPr>
+        <w:t>€2,000 earners and €6,000 earners hit the same empty account by payday.</w:t>
+      </w:r>
+    </w:p>
+    <w:p>
+      <w:pPr>
+        <w:spacing w:before="0" w:after="0"/>
+        <w:ind w:left="283"/>
+      </w:pPr>
+      <w:r>
+        <w:rPr>
+          <w:sz w:val="16"/>
+        </w:rPr>
+      </w:r>
+    </w:p>
+    <w:p>
+      <w:pPr>
+        <w:spacing w:before="0" w:after="0"/>
+        <w:ind w:left="283"/>
+      </w:pPr>
+      <w:r>
+        <w:rPr>
+          <w:sz w:val="16"/>
+        </w:rPr>
+        <w:t>Mapped out 5 patterns that explain why. None of them are about discipline.</w:t>
+      </w:r>
+    </w:p>
+    <w:p>
+      <w:pPr>
+        <w:spacing w:before="0" w:after="0"/>
+        <w:ind w:left="283"/>
+      </w:pPr>
+      <w:r>
+        <w:rPr>
+          <w:sz w:val="16"/>
+        </w:rPr>
+        <w:t>They're behavioral — and they have structural fixes, not willpower fixes.</w:t>
+      </w:r>
+    </w:p>
+    <w:p>
+      <w:pPr>
+        <w:spacing w:before="0" w:after="0"/>
+        <w:ind w:left="283"/>
+      </w:pPr>
+      <w:r>
+        <w:rPr>
+          <w:sz w:val="16"/>
+        </w:rPr>
+      </w:r>
+    </w:p>
+    <w:p>
+      <w:pPr>
+        <w:spacing w:before="0" w:after="0"/>
+        <w:ind w:left="283"/>
+      </w:pPr>
+      <w:r>
+        <w:rPr>
+          <w:sz w:val="16"/>
+        </w:rPr>
+        <w:t>The one that surprised me most: the Pre-Spend. Your brain allocates your salary</w:t>
+      </w:r>
+    </w:p>
+    <w:p>
+      <w:pPr>
+        <w:spacing w:before="0" w:after="0"/>
+        <w:ind w:left="283"/>
+      </w:pPr>
+      <w:r>
+        <w:rPr>
+          <w:sz w:val="16"/>
+        </w:rPr>
+        <w:t>before it arrives. By Friday, it's just processing a transaction that closed on Wednesday.</w:t>
+      </w:r>
+    </w:p>
+    <w:p>
+      <w:pPr>
+        <w:spacing w:before="0" w:after="0"/>
+        <w:ind w:left="283"/>
+      </w:pPr>
+      <w:r>
+        <w:rPr>
+          <w:sz w:val="16"/>
+        </w:rPr>
+      </w:r>
+    </w:p>
+    <w:p>
+      <w:pPr>
+        <w:spacing w:before="0" w:after="0"/>
+        <w:ind w:left="283"/>
+      </w:pPr>
+      <w:r>
+        <w:rPr>
+          <w:sz w:val="16"/>
+        </w:rPr>
+        <w:t>Full breakdown here: [URL]</w:t>
+      </w:r>
+    </w:p>
+    <w:p>
+      <w:pPr>
+        <w:spacing w:before="120" w:after="40"/>
+      </w:pPr>
+      <w:r>
+        <w:rPr>
+          <w:color w:val="CCCCCC"/>
+          <w:sz w:val="14"/>
+        </w:rPr>
+        <w:t>──────────────────────────────────────────────────────────────────────────────────────────</w:t>
+      </w:r>
+    </w:p>
+    <w:p>
+      <w:pPr>
+        <w:spacing w:before="280" w:after="80"/>
+      </w:pPr>
+      <w:r>
+        <w:rPr>
+          <w:b/>
+          <w:color w:val="B02A2A"/>
+          <w:sz w:val="22"/>
+        </w:rPr>
+        <w:t>── 12. HORA DE PUBLICACIÓN ──</w:t>
+      </w:r>
+    </w:p>
+    <w:p>
+      <w:pPr>
+        <w:spacing w:before="20" w:after="40"/>
       </w:pPr>
       <w:r>
         <w:rPr>
@@ -224,358 +1943,19 @@
           <w:color w:val="777777"/>
           <w:sz w:val="18"/>
         </w:rPr>
-        <w:t>DESCRIPTION:</w:t>
+        <w:t xml:space="preserve">ESPAÑA (CEST):  </w:t>
+      </w:r>
+      <w:r>
+        <w:rPr>
+          <w:color w:val="1A7A3C"/>
+          <w:sz w:val="24"/>
+        </w:rPr>
+        <w:t>JUEVES 20:15</w:t>
       </w:r>
     </w:p>
     <w:p>
       <w:pPr>
-        <w:spacing w:before="20" w:after="20"/>
-        <w:ind w:left="567"/>
-      </w:pPr>
-      <w:r>
-        <w:rPr>
-          <w:color w:val="2C3E50"/>
-          <w:sz w:val="20"/>
-        </w:rPr>
-        <w:t>Why does your money always disappear before payday? Not sometimes. Every month.</w:t>
-      </w:r>
-    </w:p>
-    <w:p>
-      <w:pPr>
-        <w:spacing w:before="20" w:after="20"/>
-        <w:ind w:left="567"/>
-      </w:pPr>
-      <w:r>
-        <w:rPr>
-          <w:color w:val="2C3E50"/>
-          <w:sz w:val="20"/>
-        </w:rPr>
-      </w:r>
-    </w:p>
-    <w:p>
-      <w:pPr>
-        <w:spacing w:before="20" w:after="20"/>
-        <w:ind w:left="567"/>
-      </w:pPr>
-      <w:r>
-        <w:rPr>
-          <w:color w:val="2C3E50"/>
-          <w:sz w:val="20"/>
-        </w:rPr>
-        <w:t>It doesn't matter if you earn €2,000 or €6,000. Four weeks. Same empty account.</w:t>
-      </w:r>
-    </w:p>
-    <w:p>
-      <w:pPr>
-        <w:spacing w:before="20" w:after="20"/>
-        <w:ind w:left="567"/>
-      </w:pPr>
-      <w:r>
-        <w:rPr>
-          <w:color w:val="2C3E50"/>
-          <w:sz w:val="20"/>
-        </w:rPr>
-      </w:r>
-    </w:p>
-    <w:p>
-      <w:pPr>
-        <w:spacing w:before="20" w:after="20"/>
-        <w:ind w:left="567"/>
-      </w:pPr>
-      <w:r>
-        <w:rPr>
-          <w:color w:val="2C3E50"/>
-          <w:sz w:val="20"/>
-        </w:rPr>
-        <w:t>5 things are draining your money before payday — and none of them feel like mistakes when they happen.</w:t>
-      </w:r>
-    </w:p>
-    <w:p>
-      <w:pPr>
-        <w:spacing w:before="20" w:after="20"/>
-        <w:ind w:left="567"/>
-      </w:pPr>
-      <w:r>
-        <w:rPr>
-          <w:color w:val="2C3E50"/>
-          <w:sz w:val="20"/>
-        </w:rPr>
-      </w:r>
-    </w:p>
-    <w:p>
-      <w:pPr>
-        <w:spacing w:before="20" w:after="20"/>
-        <w:ind w:left="567"/>
-      </w:pPr>
-      <w:r>
-        <w:rPr>
-          <w:color w:val="2C3E50"/>
-          <w:sz w:val="20"/>
-        </w:rPr>
-        <w:t>In this video:</w:t>
-      </w:r>
-    </w:p>
-    <w:p>
-      <w:pPr>
-        <w:spacing w:before="20" w:after="20"/>
-        <w:ind w:left="567"/>
-      </w:pPr>
-      <w:r>
-        <w:rPr>
-          <w:color w:val="2C3E50"/>
-          <w:sz w:val="20"/>
-        </w:rPr>
-        <w:t>5. The Card Gap — why card payments silence the part of your brain that registers loss</w:t>
-      </w:r>
-    </w:p>
-    <w:p>
-      <w:pPr>
-        <w:spacing w:before="20" w:after="20"/>
-        <w:ind w:left="567"/>
-      </w:pPr>
-      <w:r>
-        <w:rPr>
-          <w:color w:val="2C3E50"/>
-          <w:sz w:val="20"/>
-        </w:rPr>
-        <w:t>4. The Reward Drain — the sentence that has cost more than any impulse purchase</w:t>
-      </w:r>
-    </w:p>
-    <w:p>
-      <w:pPr>
-        <w:spacing w:before="20" w:after="20"/>
-        <w:ind w:left="567"/>
-      </w:pPr>
-      <w:r>
-        <w:rPr>
-          <w:color w:val="2C3E50"/>
-          <w:sz w:val="20"/>
-        </w:rPr>
-        <w:t>3. The Invisible Drain — why your brain doesn't cancel things, it lets them run</w:t>
-      </w:r>
-    </w:p>
-    <w:p>
-      <w:pPr>
-        <w:spacing w:before="20" w:after="20"/>
-        <w:ind w:left="567"/>
-      </w:pPr>
-      <w:r>
-        <w:rPr>
-          <w:color w:val="2C3E50"/>
-          <w:sz w:val="20"/>
-        </w:rPr>
-        <w:t>2. Social Spending — the most expensive audience in your life has never spent a single dollar</w:t>
-      </w:r>
-    </w:p>
-    <w:p>
-      <w:pPr>
-        <w:spacing w:before="20" w:after="20"/>
-        <w:ind w:left="567"/>
-      </w:pPr>
-      <w:r>
-        <w:rPr>
-          <w:color w:val="2C3E50"/>
-          <w:sz w:val="20"/>
-        </w:rPr>
-        <w:t>1. The Pre-Spend — the one nobody names. It runs before the money arrives.</w:t>
-      </w:r>
-    </w:p>
-    <w:p>
-      <w:pPr>
-        <w:spacing w:before="20" w:after="20"/>
-        <w:ind w:left="567"/>
-      </w:pPr>
-      <w:r>
-        <w:rPr>
-          <w:color w:val="2C3E50"/>
-          <w:sz w:val="20"/>
-        </w:rPr>
-      </w:r>
-    </w:p>
-    <w:p>
-      <w:pPr>
-        <w:spacing w:before="20" w:after="20"/>
-        <w:ind w:left="567"/>
-      </w:pPr>
-      <w:r>
-        <w:rPr>
-          <w:color w:val="2C3E50"/>
-          <w:sz w:val="20"/>
-        </w:rPr>
-        <w:t>These aren't budgeting mistakes. They're not discipline failures.</w:t>
-      </w:r>
-    </w:p>
-    <w:p>
-      <w:pPr>
-        <w:spacing w:before="20" w:after="20"/>
-        <w:ind w:left="567"/>
-      </w:pPr>
-      <w:r>
-        <w:rPr>
-          <w:color w:val="2C3E50"/>
-          <w:sz w:val="20"/>
-        </w:rPr>
-        <w:t>They're patterns. And they run automatically.</w:t>
-      </w:r>
-    </w:p>
-    <w:p>
-      <w:pPr>
-        <w:spacing w:before="20" w:after="20"/>
-        <w:ind w:left="567"/>
-      </w:pPr>
-      <w:r>
-        <w:rPr>
-          <w:color w:val="2C3E50"/>
-          <w:sz w:val="20"/>
-        </w:rPr>
-      </w:r>
-    </w:p>
-    <w:p>
-      <w:pPr>
-        <w:spacing w:before="20" w:after="20"/>
-        <w:ind w:left="567"/>
-      </w:pPr>
-      <w:r>
-        <w:rPr>
-          <w:color w:val="2C3E50"/>
-          <w:sz w:val="20"/>
-        </w:rPr>
-        <w:t>We break down a new financial pattern every week. Subscribe — it's free.</w:t>
-      </w:r>
-    </w:p>
-    <w:p>
-      <w:pPr>
-        <w:spacing w:before="20" w:after="20"/>
-        <w:ind w:left="567"/>
-      </w:pPr>
-      <w:r>
-        <w:rPr>
-          <w:color w:val="2C3E50"/>
-          <w:sz w:val="20"/>
-        </w:rPr>
-      </w:r>
-    </w:p>
-    <w:p>
-      <w:pPr>
-        <w:spacing w:before="20" w:after="20"/>
-        <w:ind w:left="567"/>
-      </w:pPr>
-      <w:r>
-        <w:rPr>
-          <w:color w:val="2C3E50"/>
-          <w:sz w:val="20"/>
-        </w:rPr>
-        <w:t>#behavioralfinance #psychologyofmoney #financialpsychology #personalfinance #moneypsychology</w:t>
-      </w:r>
-    </w:p>
-    <w:p>
-      <w:pPr>
-        <w:spacing w:before="280" w:after="60"/>
-      </w:pPr>
-      <w:r>
-        <w:rPr>
-          <w:b/>
-          <w:color w:val="B02A2A"/>
-          <w:sz w:val="20"/>
-        </w:rPr>
-        <w:t>── TAGS (YouTube Studio — paste as comma-separated) ──</w:t>
-      </w:r>
-    </w:p>
-    <w:p>
-      <w:pPr>
-        <w:spacing w:before="20" w:after="20"/>
-        <w:ind w:left="567"/>
-      </w:pPr>
-      <w:r>
-        <w:rPr>
-          <w:color w:val="2C3E50"/>
-          <w:sz w:val="18"/>
-        </w:rPr>
-        <w:t>behavioral finance, psychology of money, financial psychology, why am I broke before payday,</w:t>
-      </w:r>
-    </w:p>
-    <w:p>
-      <w:pPr>
-        <w:spacing w:before="20" w:after="20"/>
-        <w:ind w:left="567"/>
-      </w:pPr>
-      <w:r>
-        <w:rPr>
-          <w:color w:val="2C3E50"/>
-          <w:sz w:val="18"/>
-        </w:rPr>
-        <w:t>money psychology, brain and money, cognitive biases money, why money disappears,</w:t>
-      </w:r>
-    </w:p>
-    <w:p>
-      <w:pPr>
-        <w:spacing w:before="20" w:after="20"/>
-        <w:ind w:left="567"/>
-      </w:pPr>
-      <w:r>
-        <w:rPr>
-          <w:color w:val="2C3E50"/>
-          <w:sz w:val="18"/>
-        </w:rPr>
-        <w:t>neuroscience money, personal finance psychology, broke before payday, card gap,</w:t>
-      </w:r>
-    </w:p>
-    <w:p>
-      <w:pPr>
-        <w:spacing w:before="20" w:after="20"/>
-        <w:ind w:left="567"/>
-      </w:pPr>
-      <w:r>
-        <w:rPr>
-          <w:color w:val="2C3E50"/>
-          <w:sz w:val="18"/>
-        </w:rPr>
-        <w:t>reward drain, invisible drain, social spending, pre-spend, money patterns,</w:t>
-      </w:r>
-    </w:p>
-    <w:p>
-      <w:pPr>
-        <w:spacing w:before="20" w:after="20"/>
-        <w:ind w:left="567"/>
-      </w:pPr>
-      <w:r>
-        <w:rPr>
-          <w:color w:val="2C3E50"/>
-          <w:sz w:val="18"/>
-        </w:rPr>
-        <w:t>why you can't save money, financial behavior, money habits, brain villain,</w:t>
-      </w:r>
-    </w:p>
-    <w:p>
-      <w:pPr>
-        <w:spacing w:before="20" w:after="20"/>
-        <w:ind w:left="567"/>
-      </w:pPr>
-      <w:r>
-        <w:rPr>
-          <w:color w:val="2C3E50"/>
-          <w:sz w:val="18"/>
-        </w:rPr>
-        <w:t>subscription drain, impulsive spending psychology, payday money gone</w:t>
-      </w:r>
-    </w:p>
-    <w:p>
-      <w:pPr>
-        <w:spacing w:before="280" w:after="60"/>
-      </w:pPr>
-      <w:r>
-        <w:rPr>
-          <w:b/>
-          <w:color w:val="B02A2A"/>
-          <w:sz w:val="20"/>
-        </w:rPr>
-        <w:t>── THUMBNAIL SPEC ──</w:t>
-      </w:r>
-    </w:p>
-    <w:p>
-      <w:pPr>
-        <w:spacing w:before="40" w:after="40"/>
-        <w:ind w:left="283"/>
+        <w:spacing w:before="20" w:after="40"/>
       </w:pPr>
       <w:r>
         <w:rPr>
@@ -583,20 +1963,19 @@
           <w:color w:val="777777"/>
           <w:sz w:val="18"/>
         </w:rPr>
-        <w:t xml:space="preserve">Background: </w:t>
+        <w:t xml:space="preserve">EST (USA):  </w:t>
       </w:r>
       <w:r>
         <w:rPr>
-          <w:color w:val="2C3E50"/>
-          <w:sz w:val="20"/>
+          <w:color w:val="777777"/>
+          <w:sz w:val="18"/>
         </w:rPr>
-        <w:t>WHITE — Andy/MoneyTom style. Not dark.</w:t>
+        <w:t>14:15 (prime time USA East Coast)</w:t>
       </w:r>
     </w:p>
     <w:p>
       <w:pPr>
-        <w:spacing w:before="40" w:after="40"/>
-        <w:ind w:left="283"/>
+        <w:spacing w:before="20" w:after="40"/>
       </w:pPr>
       <w:r>
         <w:rPr>
@@ -604,20 +1983,19 @@
           <w:color w:val="777777"/>
           <w:sz w:val="18"/>
         </w:rPr>
-        <w:t xml:space="preserve">Character: </w:t>
+        <w:t xml:space="preserve">UTC:  </w:t>
       </w:r>
       <w:r>
         <w:rPr>
-          <w:color w:val="2C3E50"/>
-          <w:sz w:val="20"/>
+          <w:color w:val="777777"/>
+          <w:sz w:val="18"/>
         </w:rPr>
-        <w:t>Alex — BLUE t-shirt, wide eyes (recognition not panic), Brain Villain lit inside skull</w:t>
+        <w:t>18:15</w:t>
       </w:r>
     </w:p>
     <w:p>
       <w:pPr>
-        <w:spacing w:before="40" w:after="40"/>
-        <w:ind w:left="283"/>
+        <w:spacing w:before="20" w:after="40"/>
       </w:pPr>
       <w:r>
         <w:rPr>
@@ -625,1497 +2003,194 @@
           <w:color w:val="777777"/>
           <w:sz w:val="18"/>
         </w:rPr>
-        <w:t xml:space="preserve">Key visual: </w:t>
+        <w:t xml:space="preserve">SECUENCIA:  </w:t>
       </w:r>
       <w:r>
         <w:rPr>
-          <w:color w:val="2C3E50"/>
-          <w:sz w:val="20"/>
+          <w:color w:val="777777"/>
+          <w:sz w:val="18"/>
         </w:rPr>
-        <w:t>Phone showing €0.00 balance. Two-day countdown to payday on calendar.</w:t>
+        <w:t>V13 ya publicado. V14 continúa la trilogía. V15 en cola tras V14.</w:t>
       </w:r>
     </w:p>
     <w:p>
       <w:pPr>
-        <w:spacing w:before="40" w:after="40"/>
-        <w:ind w:left="283"/>
+        <w:spacing w:before="20" w:after="20"/>
       </w:pPr>
       <w:r>
         <w:rPr>
-          <w:b/>
-          <w:color w:val="777777"/>
-          <w:sz w:val="18"/>
+          <w:b w:val="0"/>
+          <w:color w:val="B02A2A"/>
+          <w:sz w:val="16"/>
         </w:rPr>
-        <w:t xml:space="preserve">Text overlay: </w:t>
-      </w:r>
-      <w:r>
-        <w:rPr>
-          <w:color w:val="2C3E50"/>
-          <w:sz w:val="20"/>
-        </w:rPr>
-        <w:t>BROKE BEFORE PAYDAY — max 3 words, bold Impact, left or center</w:t>
+        <w:t>■ Cadencia canal: Lunes y Jueves 20:15 España. V13 publicó en LUNES — dato comparado con V8 (jueves) mostró arranque mucho más débil (31 vs 1,105 impresiones a 2.5h). V14 publica en JUEVES para corregir esta variable.</w:t>
       </w:r>
     </w:p>
     <w:p>
       <w:pPr>
-        <w:spacing w:before="40" w:after="40"/>
-        <w:ind w:left="283"/>
+        <w:spacing w:before="120" w:after="40"/>
       </w:pPr>
       <w:r>
         <w:rPr>
-          <w:b/>
-          <w:color w:val="777777"/>
-          <w:sz w:val="18"/>
+          <w:color w:val="CCCCCC"/>
+          <w:sz w:val="14"/>
         </w:rPr>
-        <w:t xml:space="preserve">Layout: </w:t>
-      </w:r>
-      <w:r>
-        <w:rPr>
-          <w:color w:val="2C3E50"/>
-          <w:sz w:val="20"/>
-        </w:rPr>
-        <w:t>Alex right, text left — or Alex center with text above and below</w:t>
+        <w:t>──────────────────────────────────────────────────────────────────────────────────────────</w:t>
       </w:r>
     </w:p>
     <w:p>
       <w:pPr>
-        <w:spacing w:before="40" w:after="40"/>
-        <w:ind w:left="283"/>
-      </w:pPr>
-      <w:r>
-        <w:rPr>
-          <w:b/>
-          <w:color w:val="777777"/>
-          <w:sz w:val="18"/>
-        </w:rPr>
-        <w:t xml:space="preserve">CRITICAL: </w:t>
-      </w:r>
-      <w:r>
-        <w:rPr>
-          <w:color w:val="2C3E50"/>
-          <w:sz w:val="20"/>
-        </w:rPr>
-        <w:t>Thumbnail → Title → Beat 1 continuity: Alex with €0.00 = recognition in &lt;5 seconds</w:t>
-      </w:r>
-    </w:p>
-    <w:p>
-      <w:pPr>
-        <w:spacing w:before="80" w:after="40"/>
-        <w:ind w:left="283"/>
-      </w:pPr>
-      <w:r>
-        <w:rPr>
-          <w:b/>
-          <w:color w:val="777777"/>
-          <w:sz w:val="18"/>
-        </w:rPr>
-        <w:t>Thumbnail Generation Prompt (Google Flow):</w:t>
-      </w:r>
-    </w:p>
-    <w:p>
-      <w:pPr>
-        <w:spacing w:before="20" w:after="20"/>
-        <w:ind w:left="567"/>
-      </w:pPr>
-      <w:r>
-        <w:rPr>
-          <w:color w:val="2C3E50"/>
-          <w:sz w:val="20"/>
-        </w:rPr>
-        <w:t>2D flat cartoon illustration, thick solid black outlines, clean solid color fills, no gradients.</w:t>
-      </w:r>
-    </w:p>
-    <w:p>
-      <w:pPr>
-        <w:spacing w:before="20" w:after="20"/>
-        <w:ind w:left="567"/>
-      </w:pPr>
-      <w:r>
-        <w:rPr>
-          <w:color w:val="2C3E50"/>
-          <w:sz w:val="20"/>
-        </w:rPr>
-        <w:t>Alex: large beige oval head (#F5E6C8), transparent glass upper skull revealing pink cartoon Brain Villain (#E8A598),</w:t>
-      </w:r>
-    </w:p>
-    <w:p>
-      <w:pPr>
-        <w:spacing w:before="20" w:after="20"/>
-        <w:ind w:left="567"/>
-      </w:pPr>
-      <w:r>
-        <w:rPr>
-          <w:color w:val="2C3E50"/>
-          <w:sz w:val="20"/>
-        </w:rPr>
-        <w:t>small black dot eyes, expression: wide eyes and slight jaw drop (recognition + dread — NOT panic),</w:t>
-      </w:r>
-    </w:p>
-    <w:p>
-      <w:pPr>
-        <w:spacing w:before="20" w:after="20"/>
-        <w:ind w:left="567"/>
-      </w:pPr>
-      <w:r>
-        <w:rPr>
-          <w:color w:val="2C3E50"/>
-          <w:sz w:val="20"/>
-        </w:rPr>
-        <w:t>black spiky hair, BLUE t-shirt (NOT RED — verify), gray pants.</w:t>
-      </w:r>
-    </w:p>
-    <w:p>
-      <w:pPr>
-        <w:spacing w:before="20" w:after="20"/>
-        <w:ind w:left="567"/>
-      </w:pPr>
-      <w:r>
-        <w:rPr>
-          <w:color w:val="2C3E50"/>
-          <w:sz w:val="20"/>
-        </w:rPr>
-        <w:t>Brain Villain: pink cartoon brain, heavy-lidded eyes, smirking — lit up and satisfied.</w:t>
-      </w:r>
-    </w:p>
-    <w:p>
-      <w:pPr>
-        <w:spacing w:before="20" w:after="20"/>
-        <w:ind w:left="567"/>
-      </w:pPr>
-      <w:r>
-        <w:rPr>
-          <w:color w:val="2C3E50"/>
-          <w:sz w:val="20"/>
-        </w:rPr>
-        <w:t>Alex holds phone showing €0.00 in bold. Calendar in background: two days marked to payday.</w:t>
-      </w:r>
-    </w:p>
-    <w:p>
-      <w:pPr>
-        <w:spacing w:before="20" w:after="20"/>
-        <w:ind w:left="567"/>
-      </w:pPr>
-      <w:r>
-        <w:rPr>
-          <w:color w:val="2C3E50"/>
-          <w:sz w:val="20"/>
-        </w:rPr>
-        <w:t>White background. Text overlay: BROKE BEFORE PAYDAY in bold black Impact, left side.</w:t>
-      </w:r>
-    </w:p>
-    <w:p>
-      <w:pPr>
-        <w:spacing w:before="20" w:after="20"/>
-        <w:ind w:left="567"/>
-      </w:pPr>
-      <w:r>
-        <w:rPr>
-          <w:color w:val="2C3E50"/>
-          <w:sz w:val="20"/>
-        </w:rPr>
-        <w:t>16:9 thumbnail composition. Clean, high contrast.</w:t>
-      </w:r>
-    </w:p>
-    <w:p>
-      <w:pPr>
-        <w:spacing w:before="280" w:after="60"/>
+        <w:spacing w:before="280" w:after="80"/>
       </w:pPr>
       <w:r>
         <w:rPr>
           <w:b/>
           <w:color w:val="B02A2A"/>
-          <w:sz w:val="20"/>
+          <w:sz w:val="22"/>
         </w:rPr>
-        <w:t>── REDDIT DISTRIBUTION ──</w:t>
+        <w:t>── 13. NOTAS DE OUTLIER — por qué este título y este hook ──</w:t>
       </w:r>
     </w:p>
     <w:p>
       <w:pPr>
-        <w:spacing w:before="40" w:after="40"/>
-        <w:ind w:left="283"/>
-      </w:pPr>
-      <w:r>
-        <w:rPr>
-          <w:b/>
-          <w:color w:val="777777"/>
-          <w:sz w:val="18"/>
-        </w:rPr>
-        <w:t xml:space="preserve">Primary subreddits: </w:t>
-      </w:r>
+        <w:spacing w:before="60" w:after="60"/>
+        <w:ind w:left="170"/>
+      </w:pPr>
       <w:r>
         <w:rPr>
           <w:color w:val="2C3E50"/>
-          <w:sz w:val="20"/>
+          <w:sz w:val="18"/>
         </w:rPr>
-        <w:t>r/personalfinance · r/financialindependence · r/povertyfinance</w:t>
+        <w:t>→ TÍTULO: 'broke before payday' — tema sector-wide (S22), no sub-nicho behavioral finance. Validado tras analizar outliers 'Real Estate Vs Stocks' (1.5M) y 'Leasing Vs Buying A Car' (794K) — ambos van a preguntas universales, no a jerga de nicho.</w:t>
       </w:r>
     </w:p>
     <w:p>
       <w:pPr>
-        <w:spacing w:before="40" w:after="40"/>
-        <w:ind w:left="283"/>
-      </w:pPr>
-      <w:r>
-        <w:rPr>
-          <w:b/>
-          <w:color w:val="777777"/>
-          <w:sz w:val="18"/>
-        </w:rPr>
-        <w:t xml:space="preserve">Secondary: </w:t>
-      </w:r>
+        <w:spacing w:before="60" w:after="60"/>
+        <w:ind w:left="170"/>
+      </w:pPr>
       <w:r>
         <w:rPr>
           <w:color w:val="2C3E50"/>
-          <w:sz w:val="20"/>
+          <w:sz w:val="18"/>
         </w:rPr>
-        <w:t>r/psychology · r/cogsci · r/mildlyinteresting</w:t>
+        <w:t>→ FORMATO: Lista con Ranking (5→1) — validado en outliers julio 2026 ('5 Habits REWIRING Your Brain to Stay Broke' 96×). No requiere datos científicos duros — observaciones conductuales fuertes bastan.</w:t>
       </w:r>
     </w:p>
     <w:p>
       <w:pPr>
-        <w:spacing w:before="40" w:after="40"/>
-        <w:ind w:left="283"/>
-      </w:pPr>
-      <w:r>
-        <w:rPr>
-          <w:b/>
-          <w:color w:val="777777"/>
-          <w:sz w:val="18"/>
-        </w:rPr>
-        <w:t xml:space="preserve">Post timing: </w:t>
-      </w:r>
+        <w:spacing w:before="60" w:after="60"/>
+        <w:ind w:left="170"/>
+      </w:pPr>
       <w:r>
         <w:rPr>
           <w:color w:val="2C3E50"/>
-          <w:sz w:val="20"/>
+          <w:sz w:val="18"/>
         </w:rPr>
-        <w:t>Same day as publish, after 2–3h (first wave should be visible)</w:t>
+        <w:t>→ HOOK BEAT 1 (S1 — Pregunta Sin Resolver): 'Why does your money always disappear before payday?' — Efecto Zeigarnik. El viewer ya se hace esa pregunta; el video no la responde hasta entrado el video.</w:t>
       </w:r>
     </w:p>
     <w:p>
       <w:pPr>
-        <w:spacing w:before="80" w:after="40"/>
-        <w:ind w:left="283"/>
+        <w:spacing w:before="60" w:after="60"/>
+        <w:ind w:left="170"/>
       </w:pPr>
       <w:r>
         <w:rPr>
-          <w:b/>
-          <w:color w:val="777777"/>
+          <w:color w:val="2C3E50"/>
           <w:sz w:val="18"/>
         </w:rPr>
-        <w:t>Reddit Post (r/personalfinance):</w:t>
+        <w:t>→ S17 THUMBNAIL CONTINUITY: Alex + teléfono + €0.00 en Beat 1 — el viewer reconoce la escena del thumbnail en &lt;5 segundos.</w:t>
       </w:r>
     </w:p>
     <w:p>
       <w:pPr>
-        <w:spacing w:before="20" w:after="20"/>
-        <w:ind w:left="567"/>
+        <w:spacing w:before="60" w:after="60"/>
+        <w:ind w:left="170"/>
       </w:pPr>
       <w:r>
         <w:rPr>
           <w:color w:val="2C3E50"/>
-          <w:sz w:val="20"/>
+          <w:sz w:val="18"/>
         </w:rPr>
-        <w:t>Title: The reason you're broke before payday isn't what you think</w:t>
+        <w:t>→ ESTRUCTURA 5 DRENAJES: Card Gap (dolor de pago) → Reward Drain (merecimiento) → Invisible Drain (fricción de decisión) → Social Spending (audiencia fantasma) → Pre-Spend (asignación mental previa, el reveal final).</w:t>
       </w:r>
     </w:p>
     <w:p>
       <w:pPr>
-        <w:spacing w:before="20" w:after="20"/>
-        <w:ind w:left="567"/>
+        <w:spacing w:before="60" w:after="60"/>
+        <w:ind w:left="170"/>
       </w:pPr>
       <w:r>
         <w:rPr>
           <w:color w:val="2C3E50"/>
-          <w:sz w:val="20"/>
+          <w:sz w:val="18"/>
         </w:rPr>
+        <w:t>→ VILLAIN INOCULATION: 'I already know this' es el Invisible Drain disfrazado de autoconocimiento — sella el engagement en tiempo real justo cuando el viewer podría desconectar por familiaridad.</w:t>
       </w:r>
     </w:p>
     <w:p>
       <w:pPr>
-        <w:spacing w:before="20" w:after="20"/>
-        <w:ind w:left="567"/>
+        <w:spacing w:before="60" w:after="60"/>
+        <w:ind w:left="170"/>
       </w:pPr>
       <w:r>
         <w:rPr>
           <w:color w:val="2C3E50"/>
-          <w:sz w:val="20"/>
+          <w:sz w:val="18"/>
         </w:rPr>
-        <w:t>Body:</w:t>
+        <w:t>→ IDENTITY CLOSE: 'You're not bad with money' — reencuadre no moralista, evita el recap de las 5 trampas (ya recibidas), cierre en 7 beats.</w:t>
       </w:r>
     </w:p>
     <w:p>
       <w:pPr>
-        <w:spacing w:before="20" w:after="20"/>
-        <w:ind w:left="567"/>
+        <w:spacing w:before="60" w:after="60"/>
+        <w:ind w:left="170"/>
       </w:pPr>
       <w:r>
         <w:rPr>
           <w:color w:val="2C3E50"/>
-          <w:sz w:val="20"/>
+          <w:sz w:val="18"/>
         </w:rPr>
-        <w:t>I spent a while mapping why money disappears before payday — not sometimes, but every single month —</w:t>
+        <w:t>→ TRILOGÍA: V13 (5 rewires) → V14 (5 drains) → V15 (the one fix) — end screens encadenados obligatorios para maximizar sesión y dar señal de watch-time acumulado al algoritmo.</w:t>
       </w:r>
     </w:p>
     <w:p>
       <w:pPr>
-        <w:spacing w:before="20" w:after="20"/>
-        <w:ind w:left="567"/>
+        <w:spacing w:before="60" w:after="60"/>
+        <w:ind w:left="170"/>
       </w:pPr>
       <w:r>
         <w:rPr>
           <w:color w:val="2C3E50"/>
-          <w:sz w:val="20"/>
+          <w:sz w:val="18"/>
         </w:rPr>
-        <w:t>even when income goes up.</w:t>
+        <w:t>→ CTR TARGET: &gt;6% en primeras 48h. Retention at 30s: &gt;45%. Retention at midpoint: &gt;50%.</w:t>
       </w:r>
     </w:p>
     <w:p>
       <w:pPr>
-        <w:spacing w:before="20" w:after="20"/>
-        <w:ind w:left="567"/>
+        <w:spacing w:before="120" w:after="40"/>
       </w:pPr>
       <w:r>
         <w:rPr>
-          <w:color w:val="2C3E50"/>
-          <w:sz w:val="20"/>
+          <w:color w:val="CCCCCC"/>
+          <w:sz w:val="14"/>
         </w:rPr>
-      </w:r>
-    </w:p>
-    <w:p>
-      <w:pPr>
-        <w:spacing w:before="20" w:after="20"/>
-        <w:ind w:left="567"/>
-      </w:pPr>
-      <w:r>
-        <w:rPr>
-          <w:color w:val="2C3E50"/>
-          <w:sz w:val="20"/>
-        </w:rPr>
-        <w:t>Turned out it wasn't budgeting failures. It was 5 specific patterns that run automatically.</w:t>
-      </w:r>
-    </w:p>
-    <w:p>
-      <w:pPr>
-        <w:spacing w:before="20" w:after="20"/>
-        <w:ind w:left="567"/>
-      </w:pPr>
-      <w:r>
-        <w:rPr>
-          <w:color w:val="2C3E50"/>
-          <w:sz w:val="20"/>
-        </w:rPr>
-        <w:t>The worst one activates before the money even arrives.</w:t>
-      </w:r>
-    </w:p>
-    <w:p>
-      <w:pPr>
-        <w:spacing w:before="20" w:after="20"/>
-        <w:ind w:left="567"/>
-      </w:pPr>
-      <w:r>
-        <w:rPr>
-          <w:color w:val="2C3E50"/>
-          <w:sz w:val="20"/>
-        </w:rPr>
-      </w:r>
-    </w:p>
-    <w:p>
-      <w:pPr>
-        <w:spacing w:before="20" w:after="20"/>
-        <w:ind w:left="567"/>
-      </w:pPr>
-      <w:r>
-        <w:rPr>
-          <w:color w:val="2C3E50"/>
-          <w:sz w:val="20"/>
-        </w:rPr>
-        <w:t>The five: Card Gap, Reward Drain, Invisible Drain, Social Spending, and the Pre-Spend.</w:t>
-      </w:r>
-    </w:p>
-    <w:p>
-      <w:pPr>
-        <w:spacing w:before="20" w:after="20"/>
-        <w:ind w:left="567"/>
-      </w:pPr>
-      <w:r>
-        <w:rPr>
-          <w:color w:val="2C3E50"/>
-          <w:sz w:val="20"/>
-        </w:rPr>
-        <w:t>None of them feel like mistakes when they happen. That's what makes them effective.</w:t>
-      </w:r>
-    </w:p>
-    <w:p>
-      <w:pPr>
-        <w:spacing w:before="20" w:after="20"/>
-        <w:ind w:left="567"/>
-      </w:pPr>
-      <w:r>
-        <w:rPr>
-          <w:color w:val="2C3E50"/>
-          <w:sz w:val="20"/>
-        </w:rPr>
-      </w:r>
-    </w:p>
-    <w:p>
-      <w:pPr>
-        <w:spacing w:before="20" w:after="20"/>
-        <w:ind w:left="567"/>
-      </w:pPr>
-      <w:r>
-        <w:rPr>
-          <w:color w:val="2C3E50"/>
-          <w:sz w:val="20"/>
-        </w:rPr>
-        <w:t>Made a video going through all five and the structural fix for each:</w:t>
-      </w:r>
-    </w:p>
-    <w:p>
-      <w:pPr>
-        <w:spacing w:before="20" w:after="20"/>
-        <w:ind w:left="567"/>
-      </w:pPr>
-      <w:r>
-        <w:rPr>
-          <w:color w:val="2C3E50"/>
-          <w:sz w:val="20"/>
-        </w:rPr>
-        <w:t>[LINK]</w:t>
-      </w:r>
-    </w:p>
-    <w:p>
-      <w:pPr>
-        <w:spacing w:before="20" w:after="20"/>
-        <w:ind w:left="567"/>
-      </w:pPr>
-      <w:r>
-        <w:rPr>
-          <w:color w:val="2C3E50"/>
-          <w:sz w:val="20"/>
-        </w:rPr>
-      </w:r>
-    </w:p>
-    <w:p>
-      <w:pPr>
-        <w:spacing w:before="20" w:after="20"/>
-        <w:ind w:left="567"/>
-      </w:pPr>
-      <w:r>
-        <w:rPr>
-          <w:color w:val="2C3E50"/>
-          <w:sz w:val="20"/>
-        </w:rPr>
-        <w:t>Curious if others recognize any of these. Number 4 — the Reward Drain — seems to be universal.</w:t>
-      </w:r>
-    </w:p>
-    <w:p>
-      <w:pPr>
-        <w:spacing w:before="80" w:after="40"/>
-        <w:ind w:left="283"/>
-      </w:pPr>
-      <w:r>
-        <w:rPr>
-          <w:b/>
-          <w:color w:val="777777"/>
-          <w:sz w:val="18"/>
-        </w:rPr>
-        <w:t>Reddit Post (r/povertyfinance):</w:t>
-      </w:r>
-    </w:p>
-    <w:p>
-      <w:pPr>
-        <w:spacing w:before="20" w:after="20"/>
-        <w:ind w:left="567"/>
-      </w:pPr>
-      <w:r>
-        <w:rPr>
-          <w:color w:val="2C3E50"/>
-          <w:sz w:val="20"/>
-        </w:rPr>
-        <w:t>Title: 5 things that drain money before payday — regardless of income level</w:t>
-      </w:r>
-    </w:p>
-    <w:p>
-      <w:pPr>
-        <w:spacing w:before="20" w:after="20"/>
-        <w:ind w:left="567"/>
-      </w:pPr>
-      <w:r>
-        <w:rPr>
-          <w:color w:val="2C3E50"/>
-          <w:sz w:val="20"/>
-        </w:rPr>
-      </w:r>
-    </w:p>
-    <w:p>
-      <w:pPr>
-        <w:spacing w:before="20" w:after="20"/>
-        <w:ind w:left="567"/>
-      </w:pPr>
-      <w:r>
-        <w:rPr>
-          <w:color w:val="2C3E50"/>
-          <w:sz w:val="20"/>
-        </w:rPr>
-        <w:t>Body:</w:t>
-      </w:r>
-    </w:p>
-    <w:p>
-      <w:pPr>
-        <w:spacing w:before="20" w:after="20"/>
-        <w:ind w:left="567"/>
-      </w:pPr>
-      <w:r>
-        <w:rPr>
-          <w:color w:val="2C3E50"/>
-          <w:sz w:val="20"/>
-        </w:rPr>
-        <w:t>One thing I kept noticing: the timing doesn't change with income.</w:t>
-      </w:r>
-    </w:p>
-    <w:p>
-      <w:pPr>
-        <w:spacing w:before="20" w:after="20"/>
-        <w:ind w:left="567"/>
-      </w:pPr>
-      <w:r>
-        <w:rPr>
-          <w:color w:val="2C3E50"/>
-          <w:sz w:val="20"/>
-        </w:rPr>
-        <w:t>€2,000 earners and €6,000 earners hit the same empty account by payday.</w:t>
-      </w:r>
-    </w:p>
-    <w:p>
-      <w:pPr>
-        <w:spacing w:before="20" w:after="20"/>
-        <w:ind w:left="567"/>
-      </w:pPr>
-      <w:r>
-        <w:rPr>
-          <w:color w:val="2C3E50"/>
-          <w:sz w:val="20"/>
-        </w:rPr>
-      </w:r>
-    </w:p>
-    <w:p>
-      <w:pPr>
-        <w:spacing w:before="20" w:after="20"/>
-        <w:ind w:left="567"/>
-      </w:pPr>
-      <w:r>
-        <w:rPr>
-          <w:color w:val="2C3E50"/>
-          <w:sz w:val="20"/>
-        </w:rPr>
-        <w:t>Mapped out 5 patterns that explain why. None of them are about discipline.</w:t>
-      </w:r>
-    </w:p>
-    <w:p>
-      <w:pPr>
-        <w:spacing w:before="20" w:after="20"/>
-        <w:ind w:left="567"/>
-      </w:pPr>
-      <w:r>
-        <w:rPr>
-          <w:color w:val="2C3E50"/>
-          <w:sz w:val="20"/>
-        </w:rPr>
-        <w:t>They're behavioral — and they have structural fixes.</w:t>
-      </w:r>
-    </w:p>
-    <w:p>
-      <w:pPr>
-        <w:spacing w:before="20" w:after="20"/>
-        <w:ind w:left="567"/>
-      </w:pPr>
-      <w:r>
-        <w:rPr>
-          <w:color w:val="2C3E50"/>
-          <w:sz w:val="20"/>
-        </w:rPr>
-      </w:r>
-    </w:p>
-    <w:p>
-      <w:pPr>
-        <w:spacing w:before="20" w:after="20"/>
-        <w:ind w:left="567"/>
-      </w:pPr>
-      <w:r>
-        <w:rPr>
-          <w:color w:val="2C3E50"/>
-          <w:sz w:val="20"/>
-        </w:rPr>
-        <w:t>The one that surprised me most: the Pre-Spend. Your brain allocates your salary</w:t>
-      </w:r>
-    </w:p>
-    <w:p>
-      <w:pPr>
-        <w:spacing w:before="20" w:after="20"/>
-        <w:ind w:left="567"/>
-      </w:pPr>
-      <w:r>
-        <w:rPr>
-          <w:color w:val="2C3E50"/>
-          <w:sz w:val="20"/>
-        </w:rPr>
-        <w:t>before it arrives. By Friday, it's just processing a transaction that closed on Wednesday.</w:t>
-      </w:r>
-    </w:p>
-    <w:p>
-      <w:pPr>
-        <w:spacing w:before="20" w:after="20"/>
-        <w:ind w:left="567"/>
-      </w:pPr>
-      <w:r>
-        <w:rPr>
-          <w:color w:val="2C3E50"/>
-          <w:sz w:val="20"/>
-        </w:rPr>
-      </w:r>
-    </w:p>
-    <w:p>
-      <w:pPr>
-        <w:spacing w:before="20" w:after="20"/>
-        <w:ind w:left="567"/>
-      </w:pPr>
-      <w:r>
-        <w:rPr>
-          <w:color w:val="2C3E50"/>
-          <w:sz w:val="20"/>
-        </w:rPr>
-        <w:t>Full breakdown here: [LINK]</w:t>
-      </w:r>
-    </w:p>
-    <w:p>
-      <w:pPr>
-        <w:spacing w:before="280" w:after="60"/>
-      </w:pPr>
-      <w:r>
-        <w:rPr>
-          <w:b/>
-          <w:color w:val="B02A2A"/>
-          <w:sz w:val="20"/>
-        </w:rPr>
-        <w:t>── YOUTUBE STUDIO CONFIGURATION ──</w:t>
-      </w:r>
-    </w:p>
-    <w:p>
-      <w:pPr>
-        <w:spacing w:before="40" w:after="40"/>
-        <w:ind w:left="283"/>
-      </w:pPr>
-      <w:r>
-        <w:rPr>
-          <w:b/>
-          <w:color w:val="777777"/>
-          <w:sz w:val="18"/>
-        </w:rPr>
-        <w:t xml:space="preserve">Publish Time: </w:t>
-      </w:r>
-      <w:r>
-        <w:rPr>
-          <w:color w:val="2C3E50"/>
-          <w:sz w:val="20"/>
-        </w:rPr>
-        <w:t>Thursday 20:15 Spain CEST / 14:15 EST</w:t>
-      </w:r>
-    </w:p>
-    <w:p>
-      <w:pPr>
-        <w:spacing w:before="40" w:after="40"/>
-        <w:ind w:left="283"/>
-      </w:pPr>
-      <w:r>
-        <w:rPr>
-          <w:b/>
-          <w:color w:val="777777"/>
-          <w:sz w:val="18"/>
-        </w:rPr>
-        <w:t xml:space="preserve">Playlist: </w:t>
-      </w:r>
-      <w:r>
-        <w:rPr>
-          <w:color w:val="2C3E50"/>
-          <w:sz w:val="20"/>
-        </w:rPr>
-        <w:t>Add to: Behavioral Finance / Brain &amp; Money series</w:t>
-      </w:r>
-    </w:p>
-    <w:p>
-      <w:pPr>
-        <w:spacing w:before="40" w:after="40"/>
-        <w:ind w:left="283"/>
-      </w:pPr>
-      <w:r>
-        <w:rPr>
-          <w:b/>
-          <w:color w:val="777777"/>
-          <w:sz w:val="18"/>
-        </w:rPr>
-        <w:t xml:space="preserve">End Screen: </w:t>
-      </w:r>
-      <w:r>
-        <w:rPr>
-          <w:color w:val="2C3E50"/>
-          <w:sz w:val="20"/>
-        </w:rPr>
-        <w:t>Add subscribe button + previous video card (last 20 seconds)</w:t>
-      </w:r>
-    </w:p>
-    <w:p>
-      <w:pPr>
-        <w:spacing w:before="40" w:after="40"/>
-        <w:ind w:left="283"/>
-      </w:pPr>
-      <w:r>
-        <w:rPr>
-          <w:b/>
-          <w:color w:val="777777"/>
-          <w:sz w:val="18"/>
-        </w:rPr>
-        <w:t xml:space="preserve">Cards: </w:t>
-      </w:r>
-      <w:r>
-        <w:rPr>
-          <w:color w:val="2C3E50"/>
-          <w:sz w:val="20"/>
-        </w:rPr>
-        <w:t>Place at ~35% (CTA beat) and ~80% (Brain Villain section)</w:t>
-      </w:r>
-    </w:p>
-    <w:p>
-      <w:pPr>
-        <w:spacing w:before="40" w:after="40"/>
-        <w:ind w:left="283"/>
-      </w:pPr>
-      <w:r>
-        <w:rPr>
-          <w:b/>
-          <w:color w:val="777777"/>
-          <w:sz w:val="18"/>
-        </w:rPr>
-        <w:t xml:space="preserve">Category: </w:t>
-      </w:r>
-      <w:r>
-        <w:rPr>
-          <w:color w:val="2C3E50"/>
-          <w:sz w:val="20"/>
-        </w:rPr>
-        <w:t>Education</w:t>
-      </w:r>
-    </w:p>
-    <w:p>
-      <w:pPr>
-        <w:spacing w:before="40" w:after="40"/>
-        <w:ind w:left="283"/>
-      </w:pPr>
-      <w:r>
-        <w:rPr>
-          <w:b/>
-          <w:color w:val="777777"/>
-          <w:sz w:val="18"/>
-        </w:rPr>
-        <w:t xml:space="preserve">Language: </w:t>
-      </w:r>
-      <w:r>
-        <w:rPr>
-          <w:color w:val="2C3E50"/>
-          <w:sz w:val="20"/>
-        </w:rPr>
-        <w:t>English (US)</w:t>
-      </w:r>
-    </w:p>
-    <w:p>
-      <w:pPr>
-        <w:spacing w:before="40" w:after="40"/>
-        <w:ind w:left="283"/>
-      </w:pPr>
-      <w:r>
-        <w:rPr>
-          <w:b/>
-          <w:color w:val="777777"/>
-          <w:sz w:val="18"/>
-        </w:rPr>
-        <w:t xml:space="preserve">Subtitles: </w:t>
-      </w:r>
-      <w:r>
-        <w:rPr>
-          <w:color w:val="2C3E50"/>
-          <w:sz w:val="20"/>
-        </w:rPr>
-        <w:t>Add auto-generated, review for accuracy after upload</w:t>
-      </w:r>
-    </w:p>
-    <w:p>
-      <w:pPr>
-        <w:spacing w:before="40" w:after="40"/>
-        <w:ind w:left="283"/>
-      </w:pPr>
-      <w:r>
-        <w:rPr>
-          <w:b/>
-          <w:color w:val="777777"/>
-          <w:sz w:val="18"/>
-        </w:rPr>
-        <w:t xml:space="preserve">First Comment: </w:t>
-      </w:r>
-      <w:r>
-        <w:rPr>
-          <w:color w:val="2C3E50"/>
-          <w:sz w:val="20"/>
-        </w:rPr>
-        <w:t>Pin within 15 minutes: question to drive comments (see below)</w:t>
-      </w:r>
-    </w:p>
-    <w:p>
-      <w:pPr>
-        <w:spacing w:before="280" w:after="60"/>
-      </w:pPr>
-      <w:r>
-        <w:rPr>
-          <w:b/>
-          <w:color w:val="B02A2A"/>
-          <w:sz w:val="20"/>
-        </w:rPr>
-        <w:t>── PINNED COMMENT + REPLIES ──</w:t>
-      </w:r>
-    </w:p>
-    <w:p>
-      <w:pPr>
-        <w:spacing w:before="80" w:after="40"/>
-        <w:ind w:left="283"/>
-      </w:pPr>
-      <w:r>
-        <w:rPr>
-          <w:b/>
-          <w:color w:val="777777"/>
-          <w:sz w:val="18"/>
-        </w:rPr>
-        <w:t>Pinned Comment (post immediately):</w:t>
-      </w:r>
-    </w:p>
-    <w:p>
-      <w:pPr>
-        <w:spacing w:before="20" w:after="20"/>
-        <w:ind w:left="567"/>
-      </w:pPr>
-      <w:r>
-        <w:rPr>
-          <w:color w:val="2C3E50"/>
-          <w:sz w:val="20"/>
-        </w:rPr>
-        <w:t>Which of the 5 hit you hardest?</w:t>
-      </w:r>
-    </w:p>
-    <w:p>
-      <w:pPr>
-        <w:spacing w:before="20" w:after="20"/>
-        <w:ind w:left="567"/>
-      </w:pPr>
-      <w:r>
-        <w:rPr>
-          <w:color w:val="2C3E50"/>
-          <w:sz w:val="20"/>
-        </w:rPr>
-      </w:r>
-    </w:p>
-    <w:p>
-      <w:pPr>
-        <w:spacing w:before="20" w:after="20"/>
-        <w:ind w:left="567"/>
-      </w:pPr>
-      <w:r>
-        <w:rPr>
-          <w:color w:val="2C3E50"/>
-          <w:sz w:val="20"/>
-        </w:rPr>
-        <w:t>For me it's always been number 4 — the Reward Drain.</w:t>
-      </w:r>
-    </w:p>
-    <w:p>
-      <w:pPr>
-        <w:spacing w:before="20" w:after="20"/>
-        <w:ind w:left="567"/>
-      </w:pPr>
-      <w:r>
-        <w:rPr>
-          <w:color w:val="2C3E50"/>
-          <w:sz w:val="20"/>
-        </w:rPr>
-        <w:t>The math the brain does on a brutal Thursday is frighteningly fast.</w:t>
-      </w:r>
-    </w:p>
-    <w:p>
-      <w:pPr>
-        <w:spacing w:before="20" w:after="20"/>
-        <w:ind w:left="567"/>
-      </w:pPr>
-      <w:r>
-        <w:rPr>
-          <w:color w:val="2C3E50"/>
-          <w:sz w:val="20"/>
-        </w:rPr>
-        <w:t>Drop yours below 👇</w:t>
-      </w:r>
-    </w:p>
-    <w:p>
-      <w:pPr>
-        <w:spacing w:before="40" w:after="40"/>
-        <w:ind w:left="283"/>
-      </w:pPr>
-      <w:r>
-        <w:rPr>
-          <w:b/>
-          <w:color w:val="1A7A3C"/>
-          <w:sz w:val="18"/>
-        </w:rPr>
-        <w:t xml:space="preserve">Comment 1 suggestion: </w:t>
-      </w:r>
-      <w:r>
-        <w:rPr>
-          <w:color w:val="2C3E50"/>
-          <w:sz w:val="20"/>
-        </w:rPr>
-        <w:t>The Pre-Spend is the one I can't unsee now. I check my balance on Wednesday and it's fine. By Friday when the money hits, somehow it's already gone. That receipt dated Wednesday is real.</w:t>
-      </w:r>
-    </w:p>
-    <w:p>
-      <w:pPr>
-        <w:spacing w:before="40" w:after="40"/>
-        <w:ind w:left="283"/>
-      </w:pPr>
-      <w:r>
-        <w:rPr>
-          <w:b/>
-          <w:color w:val="1A7A3C"/>
-          <w:sz w:val="18"/>
-        </w:rPr>
-        <w:t xml:space="preserve">Comment 2 suggestion: </w:t>
-      </w:r>
-      <w:r>
-        <w:rPr>
-          <w:color w:val="2C3E50"/>
-          <w:sz w:val="20"/>
-        </w:rPr>
-        <w:t>The ghost audience bit was uncomfortable because I have 3 items in my closet that were bought for people who weren't even in the room. And still wouldn't have noticed.</w:t>
-      </w:r>
-    </w:p>
-    <w:p>
-      <w:pPr>
-        <w:spacing w:before="40" w:after="40"/>
-        <w:ind w:left="283"/>
-      </w:pPr>
-      <w:r>
-        <w:rPr>
-          <w:b/>
-          <w:color w:val="1A7A3C"/>
-          <w:sz w:val="18"/>
-        </w:rPr>
-        <w:t xml:space="preserve">Comment 3 suggestion: </w:t>
-      </w:r>
-      <w:r>
-        <w:rPr>
-          <w:color w:val="2C3E50"/>
-          <w:sz w:val="20"/>
-        </w:rPr>
-        <w:t>The Card Gap number (20-47% more spending) is the one I'd have argued with before this. Now I can't use a card for groceries without thinking about it.</w:t>
-      </w:r>
-    </w:p>
-    <w:p>
-      <w:pPr>
-        <w:spacing w:before="40" w:after="40"/>
-        <w:ind w:left="283"/>
-      </w:pPr>
-      <w:r>
-        <w:rPr>
-          <w:b/>
-          <w:color w:val="1A7A3C"/>
-          <w:sz w:val="18"/>
-        </w:rPr>
-        <w:t xml:space="preserve">Comment 4 suggestion: </w:t>
-      </w:r>
-      <w:r>
-        <w:rPr>
-          <w:color w:val="2C3E50"/>
-          <w:sz w:val="20"/>
-        </w:rPr>
-        <w:t>The annual subscription audit is the most underrated tip here. Once. Per year. That's the version I can actually do.</w:t>
-      </w:r>
-    </w:p>
-    <w:p>
-      <w:pPr>
-        <w:spacing w:before="40" w:after="40"/>
-        <w:ind w:left="283"/>
-      </w:pPr>
-      <w:r>
-        <w:rPr>
-          <w:b/>
-          <w:color w:val="1A7A3C"/>
-          <w:sz w:val="18"/>
-        </w:rPr>
-        <w:t xml:space="preserve">Comment 5 suggestion: </w:t>
-      </w:r>
-      <w:r>
-        <w:rPr>
-          <w:color w:val="2C3E50"/>
-          <w:sz w:val="20"/>
-        </w:rPr>
-        <w:t>'Not five solutions. One.' — I need that video to exist immediately.</w:t>
+        <w:t>──────────────────────────────────────────────────────────────────────────────────────────</w:t>
       </w:r>
     </w:p>
     <w:p/>
     <w:p>
       <w:pPr>
-        <w:spacing w:before="40" w:after="40"/>
-        <w:ind w:left="283"/>
+        <w:jc w:val="center"/>
       </w:pPr>
       <w:r>
         <w:rPr>
-          <w:b/>
           <w:color w:val="777777"/>
-          <w:sz w:val="18"/>
+          <w:sz w:val="16"/>
         </w:rPr>
-        <w:t xml:space="preserve">Reply to Comment 1: </w:t>
-      </w:r>
-      <w:r>
-        <w:rPr>
-          <w:color w:val="2C3E50"/>
-          <w:sz w:val="20"/>
-        </w:rPr>
-        <w:t>The Wednesday receipt is the most disorienting part. The money arrives and your brain is like 'already processed that.' Literally just confirmation at that point.</w:t>
-      </w:r>
-    </w:p>
-    <w:p>
-      <w:pPr>
-        <w:spacing w:before="40" w:after="40"/>
-        <w:ind w:left="283"/>
-      </w:pPr>
-      <w:r>
-        <w:rPr>
-          <w:b/>
-          <w:color w:val="777777"/>
-          <w:sz w:val="18"/>
-        </w:rPr>
-        <w:t xml:space="preserve">Reply to Comment 2: </w:t>
-      </w:r>
-      <w:r>
-        <w:rPr>
-          <w:color w:val="2C3E50"/>
-          <w:sz w:val="20"/>
-        </w:rPr>
-        <w:t>The ghost audience living in your head and having expensive taste — that's the part that doesn't go away. The question 'who am I buying this for' starts following every purchase.</w:t>
-      </w:r>
-    </w:p>
-    <w:p>
-      <w:pPr>
-        <w:spacing w:before="40" w:after="40"/>
-        <w:ind w:left="283"/>
-      </w:pPr>
-      <w:r>
-        <w:rPr>
-          <w:b/>
-          <w:color w:val="777777"/>
-          <w:sz w:val="18"/>
-        </w:rPr>
-        <w:t xml:space="preserve">Reply to Comment 3: </w:t>
-      </w:r>
-      <w:r>
-        <w:rPr>
-          <w:color w:val="2C3E50"/>
-          <w:sz w:val="20"/>
-        </w:rPr>
-        <w:t>The 47% is the high end but even the low end (20%) over a year compounds into something you can feel. One cash category is genuinely enough to change the signal.</w:t>
-      </w:r>
-    </w:p>
-    <w:p>
-      <w:pPr>
-        <w:spacing w:before="40" w:after="40"/>
-        <w:ind w:left="283"/>
-      </w:pPr>
-      <w:r>
-        <w:rPr>
-          <w:b/>
-          <w:color w:val="777777"/>
-          <w:sz w:val="18"/>
-        </w:rPr>
-        <w:t xml:space="preserve">Reply to Comment 4: </w:t>
-      </w:r>
-      <w:r>
-        <w:rPr>
-          <w:color w:val="2C3E50"/>
-          <w:sz w:val="20"/>
-        </w:rPr>
-        <w:t>Once per year. That's it. The reason most people don't do it is the feeling that it should be more frequent — and that friction kills it before it starts.</w:t>
-      </w:r>
-    </w:p>
-    <w:p>
-      <w:pPr>
-        <w:spacing w:before="40" w:after="40"/>
-        <w:ind w:left="283"/>
-      </w:pPr>
-      <w:r>
-        <w:rPr>
-          <w:b/>
-          <w:color w:val="777777"/>
-          <w:sz w:val="18"/>
-        </w:rPr>
-        <w:t xml:space="preserve">Reply to Comment 5: </w:t>
-      </w:r>
-      <w:r>
-        <w:rPr>
-          <w:color w:val="2C3E50"/>
-          <w:sz w:val="20"/>
-        </w:rPr>
-        <w:t>Thursday. See you there.</w:t>
-      </w:r>
-    </w:p>
-    <w:p>
-      <w:pPr>
-        <w:spacing w:before="280" w:after="60"/>
-      </w:pPr>
-      <w:r>
-        <w:rPr>
-          <w:b/>
-          <w:color w:val="B02A2A"/>
-          <w:sz w:val="20"/>
-        </w:rPr>
-        <w:t>── PRE-PUBLISH CHECKLIST ──</w:t>
-      </w:r>
-    </w:p>
-    <w:p>
-      <w:pPr>
-        <w:spacing w:before="20" w:after="40"/>
-        <w:ind w:left="567"/>
-      </w:pPr>
-      <w:r>
-        <w:rPr>
-          <w:color w:val="2C3E50"/>
-          <w:sz w:val="20"/>
-        </w:rPr>
-        <w:t>☐  Script (95 beats) narrated and audio rendered in ElevenLabs</w:t>
-      </w:r>
-    </w:p>
-    <w:p>
-      <w:pPr>
-        <w:spacing w:before="20" w:after="40"/>
-        <w:ind w:left="567"/>
-      </w:pPr>
-      <w:r>
-        <w:rPr>
-          <w:color w:val="2C3E50"/>
-          <w:sz w:val="20"/>
-        </w:rPr>
-        <w:t>☐  All 95 images generated in Google Flow — BLUE t-shirt verified in all</w:t>
-      </w:r>
-    </w:p>
-    <w:p>
-      <w:pPr>
-        <w:spacing w:before="20" w:after="40"/>
-        <w:ind w:left="567"/>
-      </w:pPr>
-      <w:r>
-        <w:rPr>
-          <w:color w:val="2C3E50"/>
-          <w:sz w:val="20"/>
-        </w:rPr>
-        <w:t>☐  CapCut: Zoom In Slow (Acercamiento) on all clips, Zoom In Fast on key numbers</w:t>
-      </w:r>
-    </w:p>
-    <w:p>
-      <w:pPr>
-        <w:spacing w:before="20" w:after="40"/>
-        <w:ind w:left="567"/>
-      </w:pPr>
-      <w:r>
-        <w:rPr>
-          <w:color w:val="2C3E50"/>
-          <w:sz w:val="20"/>
-        </w:rPr>
-        <w:t>☐  Music: royalty-free atmospheric ambient piano — consistent volume under narration</w:t>
-      </w:r>
-    </w:p>
-    <w:p>
-      <w:pPr>
-        <w:spacing w:before="20" w:after="40"/>
-        <w:ind w:left="567"/>
-      </w:pPr>
-      <w:r>
-        <w:rPr>
-          <w:color w:val="2C3E50"/>
-          <w:sz w:val="20"/>
-        </w:rPr>
-        <w:t>☐  Thumbnail: Alex + €0.00 + Brain Villain lit — WHITE background — text left/center</w:t>
-      </w:r>
-    </w:p>
-    <w:p>
-      <w:pPr>
-        <w:spacing w:before="20" w:after="40"/>
-        <w:ind w:left="567"/>
-      </w:pPr>
-      <w:r>
-        <w:rPr>
-          <w:color w:val="2C3E50"/>
-          <w:sz w:val="20"/>
-        </w:rPr>
-        <w:t>☐  Thumbnail tested: thumbnail → title → beat 1 continuity &lt;5 seconds</w:t>
-      </w:r>
-    </w:p>
-    <w:p>
-      <w:pPr>
-        <w:spacing w:before="20" w:after="40"/>
-        <w:ind w:left="567"/>
-      </w:pPr>
-      <w:r>
-        <w:rPr>
-          <w:color w:val="2C3E50"/>
-          <w:sz w:val="20"/>
-        </w:rPr>
-        <w:t>☐  YouTube title confirmed: 5 Things That Drain Your Money Before Payday (No Matter What You Earn)</w:t>
-      </w:r>
-    </w:p>
-    <w:p>
-      <w:pPr>
-        <w:spacing w:before="20" w:after="40"/>
-        <w:ind w:left="567"/>
-      </w:pPr>
-      <w:r>
-        <w:rPr>
-          <w:color w:val="2C3E50"/>
-          <w:sz w:val="20"/>
-        </w:rPr>
-        <w:t>☐  Description pasted — check all 5 items listed correctly</w:t>
-      </w:r>
-    </w:p>
-    <w:p>
-      <w:pPr>
-        <w:spacing w:before="20" w:after="40"/>
-        <w:ind w:left="567"/>
-      </w:pPr>
-      <w:r>
-        <w:rPr>
-          <w:color w:val="2C3E50"/>
-          <w:sz w:val="20"/>
-        </w:rPr>
-        <w:t>☐  Tags pasted (comma-separated in YouTube Studio)</w:t>
-      </w:r>
-    </w:p>
-    <w:p>
-      <w:pPr>
-        <w:spacing w:before="20" w:after="40"/>
-        <w:ind w:left="567"/>
-      </w:pPr>
-      <w:r>
-        <w:rPr>
-          <w:color w:val="2C3E50"/>
-          <w:sz w:val="20"/>
-        </w:rPr>
-        <w:t>☐  Publish scheduled: Thursday 20:15 Spain / 14:15 EST</w:t>
-      </w:r>
-    </w:p>
-    <w:p>
-      <w:pPr>
-        <w:spacing w:before="20" w:after="40"/>
-        <w:ind w:left="567"/>
-      </w:pPr>
-      <w:r>
-        <w:rPr>
-          <w:color w:val="2C3E50"/>
-          <w:sz w:val="20"/>
-        </w:rPr>
-        <w:t>☐  End screen set (subscribe + previous video card)</w:t>
-      </w:r>
-    </w:p>
-    <w:p>
-      <w:pPr>
-        <w:spacing w:before="20" w:after="40"/>
-        <w:ind w:left="567"/>
-      </w:pPr>
-      <w:r>
-        <w:rPr>
-          <w:color w:val="2C3E50"/>
-          <w:sz w:val="20"/>
-        </w:rPr>
-        <w:t>☐  Cards placed at ~35% and ~80%</w:t>
-      </w:r>
-    </w:p>
-    <w:p>
-      <w:pPr>
-        <w:spacing w:before="20" w:after="40"/>
-        <w:ind w:left="567"/>
-      </w:pPr>
-      <w:r>
-        <w:rPr>
-          <w:color w:val="2C3E50"/>
-          <w:sz w:val="20"/>
-        </w:rPr>
-        <w:t>☐  Reddit posts drafted and ready to paste day-of</w:t>
-      </w:r>
-    </w:p>
-    <w:p>
-      <w:pPr>
-        <w:spacing w:before="20" w:after="40"/>
-        <w:ind w:left="567"/>
-      </w:pPr>
-      <w:r>
-        <w:rPr>
-          <w:color w:val="2C3E50"/>
-          <w:sz w:val="20"/>
-        </w:rPr>
-        <w:t>☐  Pinned comment ready — post within 15 minutes of going live</w:t>
-      </w:r>
-    </w:p>
-    <w:p>
-      <w:pPr>
-        <w:spacing w:before="20" w:after="40"/>
-        <w:ind w:left="567"/>
-      </w:pPr>
-      <w:r>
-        <w:rPr>
-          <w:color w:val="2C3E50"/>
-          <w:sz w:val="20"/>
-        </w:rPr>
-        <w:t>☐  V13 analytics checked before publishing — note current state</w:t>
-      </w:r>
-    </w:p>
-    <w:p>
-      <w:pPr>
-        <w:spacing w:before="280" w:after="60"/>
-      </w:pPr>
-      <w:r>
-        <w:rPr>
-          <w:b/>
-          <w:color w:val="B02A2A"/>
-          <w:sz w:val="20"/>
-        </w:rPr>
-        <w:t>── NEXT VIDEO — V15 PLANNING NOTE ──</w:t>
-      </w:r>
-    </w:p>
-    <w:p>
-      <w:pPr>
-        <w:spacing w:before="40" w:after="40"/>
-        <w:ind w:left="283"/>
-      </w:pPr>
-      <w:r>
-        <w:rPr>
-          <w:b/>
-          <w:color w:val="777777"/>
-          <w:sz w:val="18"/>
-        </w:rPr>
-        <w:t xml:space="preserve">Tease in V14: </w:t>
-      </w:r>
-      <w:r>
-        <w:rPr>
-          <w:color w:val="2C3E50"/>
-          <w:sz w:val="20"/>
-        </w:rPr>
-        <w:t>Next week — the one decision that stops all five.</w:t>
-      </w:r>
-    </w:p>
-    <w:p>
-      <w:pPr>
-        <w:spacing w:before="40" w:after="40"/>
-        <w:ind w:left="283"/>
-      </w:pPr>
-      <w:r>
-        <w:rPr>
-          <w:b/>
-          <w:color w:val="777777"/>
-          <w:sz w:val="18"/>
-        </w:rPr>
-        <w:t xml:space="preserve">Hook commitment: </w:t>
-      </w:r>
-      <w:r>
-        <w:rPr>
-          <w:color w:val="2C3E50"/>
-          <w:sz w:val="20"/>
-        </w:rPr>
-        <w:t>ONE DECISION. Made once. Before the patterns activate.</w:t>
-      </w:r>
-    </w:p>
-    <w:p>
-      <w:pPr>
-        <w:spacing w:before="40" w:after="40"/>
-        <w:ind w:left="283"/>
-      </w:pPr>
-      <w:r>
-        <w:rPr>
-          <w:b/>
-          <w:color w:val="777777"/>
-          <w:sz w:val="18"/>
-        </w:rPr>
-        <w:t xml:space="preserve">Hook Strategy (do NOT repeat S1): </w:t>
-      </w:r>
-      <w:r>
-        <w:rPr>
-          <w:color w:val="2C3E50"/>
-          <w:sz w:val="20"/>
-        </w:rPr>
-        <w:t>Use S3 (In Medias Res) or S4 (Contraintuitiva) — check rotation table</w:t>
-      </w:r>
-    </w:p>
-    <w:p>
-      <w:pPr>
-        <w:spacing w:before="40" w:after="40"/>
-        <w:ind w:left="283"/>
-      </w:pPr>
-      <w:r>
-        <w:rPr>
-          <w:b/>
-          <w:color w:val="777777"/>
-          <w:sz w:val="18"/>
-        </w:rPr>
-        <w:t xml:space="preserve">Format options: </w:t>
-      </w:r>
-      <w:r>
-        <w:rPr>
-          <w:color w:val="2C3E50"/>
-          <w:sz w:val="20"/>
-        </w:rPr>
-        <w:t>Mechanism deep-dive OR comparativa (one decision vs five individual fixes)</w:t>
-      </w:r>
-    </w:p>
-    <w:p>
-      <w:pPr>
-        <w:spacing w:before="40" w:after="40"/>
-        <w:ind w:left="283"/>
-      </w:pPr>
-      <w:r>
-        <w:rPr>
-          <w:b/>
-          <w:color w:val="777777"/>
-          <w:sz w:val="18"/>
-        </w:rPr>
-        <w:t xml:space="preserve">Keyword target: </w:t>
-      </w:r>
-      <w:r>
-        <w:rPr>
-          <w:color w:val="2C3E50"/>
-          <w:sz w:val="20"/>
-        </w:rPr>
-        <w:t>behavioral finance / save more tomorrow / automatizar finanzas</w:t>
-      </w:r>
-    </w:p>
-    <w:p>
-      <w:pPr>
-        <w:spacing w:before="40" w:after="40"/>
-        <w:ind w:left="283"/>
-      </w:pPr>
-      <w:r>
-        <w:rPr>
-          <w:b/>
-          <w:color w:val="777777"/>
-          <w:sz w:val="18"/>
-        </w:rPr>
-        <w:t xml:space="preserve">Note: </w:t>
-      </w:r>
-      <w:r>
-        <w:rPr>
-          <w:color w:val="2C3E50"/>
-          <w:sz w:val="20"/>
-        </w:rPr>
-        <w:t>The 'one decision' tease creates committed viewers — V15 must deliver that promise immediately.</w:t>
+        <w:t>NEUROCENTS · V14 FINAL · PRE-PUBLISH CHECKLIST · 5 Things That Drain Your Money Before Payday (No Matter What You Earn) · 20:15 España</w:t>
       </w:r>
     </w:p>
     <w:sectPr>

</xml_diff>